<commit_message>
chore(branding): update app branding from Namma Bengaluru Traffic Copilot to Namma Travel
</commit_message>
<xml_diff>
--- a/agents/namma-traffic-agent/Namma_Travel_App_Presentation.docx
+++ b/agents/namma-traffic-agent/Namma_Travel_App_Presentation.docx
@@ -13,7 +13,7 @@
           <w:color w:val="1A73E8"/>
           <w:sz w:val="52"/>
         </w:rPr>
-        <w:t>📱 Namma Bengaluru Travel App</w:t>
+        <w:t>📱 Namma Travel</w:t>
       </w:r>
     </w:p>
     <w:p>
@@ -26,7 +26,7 @@
           <w:color w:val="475569"/>
           <w:sz w:val="28"/>
         </w:rPr>
-        <w:t>Cross-Platform Mobile Transit Copilot &amp; Fare Optimizer for Android &amp; iPhone</w:t>
+        <w:t>Cross-Platform Mobile Transit &amp; Fare Optimizer for Android &amp; iPhone</w:t>
       </w:r>
     </w:p>
     <w:tbl>
@@ -2546,7 +2546,7 @@
         <w:color w:val="94A3B8"/>
         <w:sz w:val="17"/>
       </w:rPr>
-      <w:t>Namma Bengaluru Travel App — Mobile Executive Briefing</w:t>
+      <w:t>Namma Travel — Mobile Executive Briefing</w:t>
     </w:r>
   </w:p>
 </w:hdr>

</xml_diff>

<commit_message>
docs: enrich Word presentation with dedicated AI Agent tool-calling architecture visuals
</commit_message>
<xml_diff>
--- a/agents/namma-traffic-agent/Namma_Travel_App_Presentation.docx
+++ b/agents/namma-traffic-agent/Namma_Travel_App_Presentation.docx
@@ -290,7 +290,557 @@
           <w:color w:val="0F172A"/>
           <w:sz w:val="32"/>
         </w:rPr>
-        <w:t>2. Multimodal Transit Intelligence &amp; Cost Savings</w:t>
+        <w:t>2. Namma Travel AI Agent Architecture &amp; Autonomous Reasoning</w:t>
+      </w:r>
+    </w:p>
+    <w:p>
+      <w:r>
+        <w:t>At the core of Namma Travel is an autonomous transit intelligence agent (NammaTrafficAgent) powered by Google GenAI (Gemini 2.5 Flash SDK) with dynamic tool-calling reasoning and a deterministic local transit heuristics engine. The agent deciphers natural language commute queries, selects the most relevant transit tools, and synthesizes actionable departure and fare-saving advice:</w:t>
+      </w:r>
+    </w:p>
+    <w:p>
+      <w:pPr>
+        <w:spacing w:after="80"/>
+        <w:jc w:val="center"/>
+      </w:pPr>
+    </w:p>
+    <w:p>
+      <w:r>
+        <w:drawing>
+          <wp:inline xmlns:a="http://schemas.openxmlformats.org/drawingml/2006/main" xmlns:pic="http://schemas.openxmlformats.org/drawingml/2006/picture">
+            <wp:extent cx="5943600" cy="3042557"/>
+            <wp:docPr id="1" name="Picture 1"/>
+            <wp:cNvGraphicFramePr>
+              <a:graphicFrameLocks noChangeAspect="1"/>
+            </wp:cNvGraphicFramePr>
+            <a:graphic>
+              <a:graphicData uri="http://schemas.openxmlformats.org/drawingml/2006/picture">
+                <pic:pic>
+                  <pic:nvPicPr>
+                    <pic:cNvPr id="0" name="ai_agent_architecture.png"/>
+                    <pic:cNvPicPr/>
+                  </pic:nvPicPr>
+                  <pic:blipFill>
+                    <a:blip r:embed="rId11"/>
+                    <a:stretch>
+                      <a:fillRect/>
+                    </a:stretch>
+                  </pic:blipFill>
+                  <pic:spPr>
+                    <a:xfrm>
+                      <a:off x="0" y="0"/>
+                      <a:ext cx="5943600" cy="3042557"/>
+                    </a:xfrm>
+                    <a:prstGeom prst="rect"/>
+                  </pic:spPr>
+                </pic:pic>
+              </a:graphicData>
+            </a:graphic>
+          </wp:inline>
+        </w:drawing>
+      </w:r>
+    </w:p>
+    <w:p>
+      <w:pPr>
+        <w:spacing w:after="200"/>
+        <w:jc w:val="center"/>
+      </w:pPr>
+      <w:r>
+        <w:rPr>
+          <w:i/>
+          <w:color w:val="64748B"/>
+          <w:sz w:val="17"/>
+        </w:rPr>
+        <w:t>Figure 1: Autonomous AI Agent Architecture, Tool-Calling Loop, and Specialized Bengaluru Transit Tools</w:t>
+      </w:r>
+    </w:p>
+    <w:p>
+      <w:r>
+        <w:t>Specialized Transit Tools Executed by the AI Agent:</w:t>
+      </w:r>
+    </w:p>
+    <w:tbl>
+      <w:tblPr>
+        <w:tblW w:type="auto" w:w="0"/>
+        <w:jc w:val="center"/>
+        <w:tblLayout w:type="fixed"/>
+        <w:tblLook w:firstColumn="1" w:firstRow="1" w:lastColumn="0" w:lastRow="0" w:noHBand="0" w:noVBand="1" w:val="04A0"/>
+      </w:tblPr>
+      <w:tblGrid>
+        <w:gridCol w:w="2592"/>
+        <w:gridCol w:w="3312"/>
+        <w:gridCol w:w="3456"/>
+      </w:tblGrid>
+      <w:tr>
+        <w:tc>
+          <w:tcPr>
+            <w:tcW w:type="dxa" w:w="3312"/>
+            <w:shd w:fill="1A73E8"/>
+            <w:tcMar>
+              <w:top w:w="80" w:type="dxa"/>
+              <w:bottom w:w="80" w:type="dxa"/>
+              <w:left w:w="100" w:type="dxa"/>
+              <w:right w:w="100" w:type="dxa"/>
+            </w:tcMar>
+          </w:tcPr>
+          <w:p>
+            <w:pPr>
+              <w:jc w:val="center"/>
+            </w:pPr>
+            <w:r>
+              <w:rPr>
+                <w:b/>
+                <w:color w:val="FFFFFF"/>
+                <w:sz w:val="17"/>
+              </w:rPr>
+              <w:t>TOOL NAME</w:t>
+            </w:r>
+          </w:p>
+        </w:tc>
+        <w:tc>
+          <w:tcPr>
+            <w:tcW w:type="dxa" w:w="3312"/>
+            <w:shd w:fill="1A73E8"/>
+            <w:tcMar>
+              <w:top w:w="80" w:type="dxa"/>
+              <w:bottom w:w="80" w:type="dxa"/>
+              <w:left w:w="100" w:type="dxa"/>
+              <w:right w:w="100" w:type="dxa"/>
+            </w:tcMar>
+          </w:tcPr>
+          <w:p>
+            <w:pPr>
+              <w:jc w:val="center"/>
+            </w:pPr>
+            <w:r>
+              <w:rPr>
+                <w:b/>
+                <w:color w:val="FFFFFF"/>
+                <w:sz w:val="17"/>
+              </w:rPr>
+              <w:t>RESPONSIBILITY</w:t>
+            </w:r>
+          </w:p>
+        </w:tc>
+        <w:tc>
+          <w:tcPr>
+            <w:tcW w:type="dxa" w:w="3312"/>
+            <w:shd w:fill="1A73E8"/>
+            <w:tcMar>
+              <w:top w:w="80" w:type="dxa"/>
+              <w:bottom w:w="80" w:type="dxa"/>
+              <w:left w:w="100" w:type="dxa"/>
+              <w:right w:w="100" w:type="dxa"/>
+            </w:tcMar>
+          </w:tcPr>
+          <w:p>
+            <w:pPr>
+              <w:jc w:val="center"/>
+            </w:pPr>
+            <w:r>
+              <w:rPr>
+                <w:b/>
+                <w:color w:val="FFFFFF"/>
+                <w:sz w:val="17"/>
+              </w:rPr>
+              <w:t>BENGALURU LOCAL INTELLIGENCE</w:t>
+            </w:r>
+          </w:p>
+        </w:tc>
+      </w:tr>
+      <w:tr>
+        <w:tc>
+          <w:tcPr>
+            <w:tcW w:type="dxa" w:w="3312"/>
+            <w:shd w:fill="FFFFFF"/>
+            <w:tcMar>
+              <w:top w:w="60" w:type="dxa"/>
+              <w:bottom w:w="60" w:type="dxa"/>
+              <w:left w:w="80" w:type="dxa"/>
+              <w:right w:w="80" w:type="dxa"/>
+            </w:tcMar>
+          </w:tcPr>
+          <w:p>
+            <w:pPr>
+              <w:jc w:val="left"/>
+            </w:pPr>
+            <w:r>
+              <w:rPr>
+                <w:b/>
+                <w:color w:val="0F172A"/>
+                <w:sz w:val="17"/>
+              </w:rPr>
+              <w:t>get_route_traffic()</w:t>
+            </w:r>
+          </w:p>
+        </w:tc>
+        <w:tc>
+          <w:tcPr>
+            <w:tcW w:type="dxa" w:w="3312"/>
+            <w:shd w:fill="FFFFFF"/>
+            <w:tcMar>
+              <w:top w:w="60" w:type="dxa"/>
+              <w:bottom w:w="60" w:type="dxa"/>
+              <w:left w:w="80" w:type="dxa"/>
+              <w:right w:w="80" w:type="dxa"/>
+            </w:tcMar>
+          </w:tcPr>
+          <w:p>
+            <w:pPr>
+              <w:jc w:val="left"/>
+            </w:pPr>
+            <w:r>
+              <w:rPr>
+                <w:color w:val="0F172A"/>
+                <w:sz w:val="17"/>
+              </w:rPr>
+              <w:t>Calculates live road delays &amp; surge multipliers</w:t>
+            </w:r>
+          </w:p>
+        </w:tc>
+        <w:tc>
+          <w:tcPr>
+            <w:tcW w:type="dxa" w:w="3312"/>
+            <w:shd w:fill="FFFFFF"/>
+            <w:tcMar>
+              <w:top w:w="60" w:type="dxa"/>
+              <w:bottom w:w="60" w:type="dxa"/>
+              <w:left w:w="80" w:type="dxa"/>
+              <w:right w:w="80" w:type="dxa"/>
+            </w:tcMar>
+          </w:tcPr>
+          <w:p>
+            <w:pPr>
+              <w:jc w:val="left"/>
+            </w:pPr>
+            <w:r>
+              <w:rPr>
+                <w:color w:val="0F172A"/>
+                <w:sz w:val="17"/>
+              </w:rPr>
+              <w:t>Calibrated on 15 core tech hubs (Koramangala, Whitefield, Hebbal, E-City)</w:t>
+            </w:r>
+          </w:p>
+        </w:tc>
+      </w:tr>
+      <w:tr>
+        <w:tc>
+          <w:tcPr>
+            <w:tcW w:type="dxa" w:w="3312"/>
+            <w:shd w:fill="F8FAFC"/>
+            <w:tcMar>
+              <w:top w:w="60" w:type="dxa"/>
+              <w:bottom w:w="60" w:type="dxa"/>
+              <w:left w:w="80" w:type="dxa"/>
+              <w:right w:w="80" w:type="dxa"/>
+            </w:tcMar>
+          </w:tcPr>
+          <w:p>
+            <w:pPr>
+              <w:jc w:val="left"/>
+            </w:pPr>
+            <w:r>
+              <w:rPr>
+                <w:b/>
+                <w:color w:val="0F172A"/>
+                <w:sz w:val="17"/>
+              </w:rPr>
+              <w:t>check_chokepoints()</w:t>
+            </w:r>
+          </w:p>
+        </w:tc>
+        <w:tc>
+          <w:tcPr>
+            <w:tcW w:type="dxa" w:w="3312"/>
+            <w:shd w:fill="F8FAFC"/>
+            <w:tcMar>
+              <w:top w:w="60" w:type="dxa"/>
+              <w:bottom w:w="60" w:type="dxa"/>
+              <w:left w:w="80" w:type="dxa"/>
+              <w:right w:w="80" w:type="dxa"/>
+            </w:tcMar>
+          </w:tcPr>
+          <w:p>
+            <w:pPr>
+              <w:jc w:val="left"/>
+            </w:pPr>
+            <w:r>
+              <w:rPr>
+                <w:color w:val="0F172A"/>
+                <w:sz w:val="17"/>
+              </w:rPr>
+              <w:t>Evaluates bottlenecks &amp; congestion severity</w:t>
+            </w:r>
+          </w:p>
+        </w:tc>
+        <w:tc>
+          <w:tcPr>
+            <w:tcW w:type="dxa" w:w="3312"/>
+            <w:shd w:fill="F8FAFC"/>
+            <w:tcMar>
+              <w:top w:w="60" w:type="dxa"/>
+              <w:bottom w:w="60" w:type="dxa"/>
+              <w:left w:w="80" w:type="dxa"/>
+              <w:right w:w="80" w:type="dxa"/>
+            </w:tcMar>
+          </w:tcPr>
+          <w:p>
+            <w:pPr>
+              <w:jc w:val="left"/>
+            </w:pPr>
+            <w:r>
+              <w:rPr>
+                <w:color w:val="0F172A"/>
+                <w:sz w:val="17"/>
+              </w:rPr>
+              <w:t>Real-time delay tracking for Silk Board, Tin Factory, Bellandur, Sony World</w:t>
+            </w:r>
+          </w:p>
+        </w:tc>
+      </w:tr>
+      <w:tr>
+        <w:tc>
+          <w:tcPr>
+            <w:tcW w:type="dxa" w:w="3312"/>
+            <w:shd w:fill="FFFFFF"/>
+            <w:tcMar>
+              <w:top w:w="60" w:type="dxa"/>
+              <w:bottom w:w="60" w:type="dxa"/>
+              <w:left w:w="80" w:type="dxa"/>
+              <w:right w:w="80" w:type="dxa"/>
+            </w:tcMar>
+          </w:tcPr>
+          <w:p>
+            <w:pPr>
+              <w:jc w:val="left"/>
+            </w:pPr>
+            <w:r>
+              <w:rPr>
+                <w:b/>
+                <w:color w:val="0F172A"/>
+                <w:sz w:val="17"/>
+              </w:rPr>
+              <w:t>get_metro_alternative()</w:t>
+            </w:r>
+          </w:p>
+        </w:tc>
+        <w:tc>
+          <w:tcPr>
+            <w:tcW w:type="dxa" w:w="3312"/>
+            <w:shd w:fill="FFFFFF"/>
+            <w:tcMar>
+              <w:top w:w="60" w:type="dxa"/>
+              <w:bottom w:w="60" w:type="dxa"/>
+              <w:left w:w="80" w:type="dxa"/>
+              <w:right w:w="80" w:type="dxa"/>
+            </w:tcMar>
+          </w:tcPr>
+          <w:p>
+            <w:pPr>
+              <w:jc w:val="left"/>
+            </w:pPr>
+            <w:r>
+              <w:rPr>
+                <w:color w:val="0F172A"/>
+                <w:sz w:val="17"/>
+              </w:rPr>
+              <w:t>Analyzes Purple, Green &amp; Yellow Metro lines</w:t>
+            </w:r>
+          </w:p>
+        </w:tc>
+        <w:tc>
+          <w:tcPr>
+            <w:tcW w:type="dxa" w:w="3312"/>
+            <w:shd w:fill="FFFFFF"/>
+            <w:tcMar>
+              <w:top w:w="60" w:type="dxa"/>
+              <w:bottom w:w="60" w:type="dxa"/>
+              <w:left w:w="80" w:type="dxa"/>
+              <w:right w:w="80" w:type="dxa"/>
+            </w:tcMar>
+          </w:tcPr>
+          <w:p>
+            <w:pPr>
+              <w:jc w:val="left"/>
+            </w:pPr>
+            <w:r>
+              <w:rPr>
+                <w:color w:val="0F172A"/>
+                <w:sz w:val="17"/>
+              </w:rPr>
+              <w:t>Door-to-door duration, exact fare, transfer stations (Majestic) &amp; walking legs</w:t>
+            </w:r>
+          </w:p>
+        </w:tc>
+      </w:tr>
+      <w:tr>
+        <w:tc>
+          <w:tcPr>
+            <w:tcW w:type="dxa" w:w="3312"/>
+            <w:shd w:fill="F8FAFC"/>
+            <w:tcMar>
+              <w:top w:w="60" w:type="dxa"/>
+              <w:bottom w:w="60" w:type="dxa"/>
+              <w:left w:w="80" w:type="dxa"/>
+              <w:right w:w="80" w:type="dxa"/>
+            </w:tcMar>
+          </w:tcPr>
+          <w:p>
+            <w:pPr>
+              <w:jc w:val="left"/>
+            </w:pPr>
+            <w:r>
+              <w:rPr>
+                <w:b/>
+                <w:color w:val="0F172A"/>
+                <w:sz w:val="17"/>
+              </w:rPr>
+              <w:t>get_bmtc_bus_details()</w:t>
+            </w:r>
+          </w:p>
+        </w:tc>
+        <w:tc>
+          <w:tcPr>
+            <w:tcW w:type="dxa" w:w="3312"/>
+            <w:shd w:fill="F8FAFC"/>
+            <w:tcMar>
+              <w:top w:w="60" w:type="dxa"/>
+              <w:bottom w:w="60" w:type="dxa"/>
+              <w:left w:w="80" w:type="dxa"/>
+              <w:right w:w="80" w:type="dxa"/>
+            </w:tcMar>
+          </w:tcPr>
+          <w:p>
+            <w:pPr>
+              <w:jc w:val="left"/>
+            </w:pPr>
+            <w:r>
+              <w:rPr>
+                <w:color w:val="0F172A"/>
+                <w:sz w:val="17"/>
+              </w:rPr>
+              <w:t>Compares Volvo Vajra AC vs Ordinary buses</w:t>
+            </w:r>
+          </w:p>
+        </w:tc>
+        <w:tc>
+          <w:tcPr>
+            <w:tcW w:type="dxa" w:w="3312"/>
+            <w:shd w:fill="F8FAFC"/>
+            <w:tcMar>
+              <w:top w:w="60" w:type="dxa"/>
+              <w:bottom w:w="60" w:type="dxa"/>
+              <w:left w:w="80" w:type="dxa"/>
+              <w:right w:w="80" w:type="dxa"/>
+            </w:tcMar>
+          </w:tcPr>
+          <w:p>
+            <w:pPr>
+              <w:jc w:val="left"/>
+            </w:pPr>
+            <w:r>
+              <w:rPr>
+                <w:color w:val="0F172A"/>
+                <w:sz w:val="17"/>
+              </w:rPr>
+              <w:t>Route numbers (500-D, 335-E, G-2), frequency, stops &amp; daily pass savings</w:t>
+            </w:r>
+          </w:p>
+        </w:tc>
+      </w:tr>
+      <w:tr>
+        <w:tc>
+          <w:tcPr>
+            <w:tcW w:type="dxa" w:w="3312"/>
+            <w:shd w:fill="FFFFFF"/>
+            <w:tcMar>
+              <w:top w:w="60" w:type="dxa"/>
+              <w:bottom w:w="60" w:type="dxa"/>
+              <w:left w:w="80" w:type="dxa"/>
+              <w:right w:w="80" w:type="dxa"/>
+            </w:tcMar>
+          </w:tcPr>
+          <w:p>
+            <w:pPr>
+              <w:jc w:val="left"/>
+            </w:pPr>
+            <w:r>
+              <w:rPr>
+                <w:b/>
+                <w:color w:val="0F172A"/>
+                <w:sz w:val="17"/>
+              </w:rPr>
+              <w:t>get_weather_waterlogging_alerts()</w:t>
+            </w:r>
+          </w:p>
+        </w:tc>
+        <w:tc>
+          <w:tcPr>
+            <w:tcW w:type="dxa" w:w="3312"/>
+            <w:shd w:fill="FFFFFF"/>
+            <w:tcMar>
+              <w:top w:w="60" w:type="dxa"/>
+              <w:bottom w:w="60" w:type="dxa"/>
+              <w:left w:w="80" w:type="dxa"/>
+              <w:right w:w="80" w:type="dxa"/>
+            </w:tcMar>
+          </w:tcPr>
+          <w:p>
+            <w:pPr>
+              <w:jc w:val="left"/>
+            </w:pPr>
+            <w:r>
+              <w:rPr>
+                <w:color w:val="0F172A"/>
+                <w:sz w:val="17"/>
+              </w:rPr>
+              <w:t>Monitors monsoon rain &amp; hazard zones</w:t>
+            </w:r>
+          </w:p>
+        </w:tc>
+        <w:tc>
+          <w:tcPr>
+            <w:tcW w:type="dxa" w:w="3312"/>
+            <w:shd w:fill="FFFFFF"/>
+            <w:tcMar>
+              <w:top w:w="60" w:type="dxa"/>
+              <w:bottom w:w="60" w:type="dxa"/>
+              <w:left w:w="80" w:type="dxa"/>
+              <w:right w:w="80" w:type="dxa"/>
+            </w:tcMar>
+          </w:tcPr>
+          <w:p>
+            <w:pPr>
+              <w:jc w:val="left"/>
+            </w:pPr>
+            <w:r>
+              <w:rPr>
+                <w:color w:val="0F172A"/>
+                <w:sz w:val="17"/>
+              </w:rPr>
+              <w:t>Real-time alerts for flooded underpasses (Panathur, Marathahalli) &amp; BBMP roadworks</w:t>
+            </w:r>
+          </w:p>
+        </w:tc>
+      </w:tr>
+    </w:tbl>
+    <w:p>
+      <w:pPr>
+        <w:spacing w:after="160"/>
+      </w:pPr>
+    </w:p>
+    <w:p>
+      <w:pPr>
+        <w:spacing w:before="280" w:after="80"/>
+      </w:pPr>
+      <w:r>
+        <w:rPr>
+          <w:rFonts w:ascii="Calibri" w:hAnsi="Calibri"/>
+          <w:b/>
+          <w:color w:val="0F172A"/>
+          <w:sz w:val="32"/>
+        </w:rPr>
+        <w:t>3. Multimodal Transit Intelligence &amp; Cost Savings</w:t>
       </w:r>
     </w:p>
     <w:p>
@@ -309,7 +859,7 @@
         <w:drawing>
           <wp:inline xmlns:a="http://schemas.openxmlformats.org/drawingml/2006/main" xmlns:pic="http://schemas.openxmlformats.org/drawingml/2006/picture">
             <wp:extent cx="5852160" cy="3035450"/>
-            <wp:docPr id="1" name="Picture 1"/>
+            <wp:docPr id="2" name="Picture 2"/>
             <wp:cNvGraphicFramePr>
               <a:graphicFrameLocks noChangeAspect="1"/>
             </wp:cNvGraphicFramePr>
@@ -321,7 +871,7 @@
                     <pic:cNvPicPr/>
                   </pic:nvPicPr>
                   <pic:blipFill>
-                    <a:blip r:embed="rId11"/>
+                    <a:blip r:embed="rId12"/>
                     <a:stretch>
                       <a:fillRect/>
                     </a:stretch>
@@ -351,7 +901,7 @@
           <w:color w:val="64748B"/>
           <w:sz w:val="17"/>
         </w:rPr>
-        <w:t>Figure 1: Comprehensive Fare vs Travel Time Benchmark across Bengaluru Transit Modes</w:t>
+        <w:t>Figure 2: Comprehensive Fare vs Travel Time Benchmark across Bengaluru Transit Modes</w:t>
       </w:r>
     </w:p>
     <w:p>
@@ -1213,7 +1763,7 @@
           <w:color w:val="0F172A"/>
           <w:sz w:val="32"/>
         </w:rPr>
-        <w:t>3. AI Bottleneck Radar &amp; Departure Optimization</w:t>
+        <w:t>4. AI Bottleneck Radar &amp; Departure Optimization</w:t>
       </w:r>
     </w:p>
     <w:p>
@@ -1231,7 +1781,7 @@
         <w:drawing>
           <wp:inline xmlns:a="http://schemas.openxmlformats.org/drawingml/2006/main" xmlns:pic="http://schemas.openxmlformats.org/drawingml/2006/picture">
             <wp:extent cx="5852160" cy="2740885"/>
-            <wp:docPr id="2" name="Picture 2"/>
+            <wp:docPr id="3" name="Picture 3"/>
             <wp:cNvGraphicFramePr>
               <a:graphicFrameLocks noChangeAspect="1"/>
             </wp:cNvGraphicFramePr>
@@ -1243,7 +1793,7 @@
                     <pic:cNvPicPr/>
                   </pic:nvPicPr>
                   <pic:blipFill>
-                    <a:blip r:embed="rId12"/>
+                    <a:blip r:embed="rId13"/>
                     <a:stretch>
                       <a:fillRect/>
                     </a:stretch>
@@ -1273,7 +1823,7 @@
           <w:color w:val="64748B"/>
           <w:sz w:val="17"/>
         </w:rPr>
-        <w:t>Figure 2: AI Predicted Delay Curves and Recommended Off-Peak Departure Windows</w:t>
+        <w:t>Figure 3: AI Predicted Delay Curves and Recommended Off-Peak Departure Windows</w:t>
       </w:r>
     </w:p>
     <w:tbl>
@@ -1315,7 +1865,7 @@
                 <w:color w:val="16A34A"/>
                 <w:sz w:val="21"/>
               </w:rPr>
-              <w:t>📌 Copilot Dynamic Advice</w:t>
+              <w:t>📌 AI Agent Recommendation Advice</w:t>
               <w:br/>
             </w:r>
             <w:r>
@@ -1351,7 +1901,7 @@
           <w:color w:val="0F172A"/>
           <w:sz w:val="32"/>
         </w:rPr>
-        <w:t>4. Secure Authentication: Gmail &amp; Mobile OTP</w:t>
+        <w:t>5. Secure Authentication: Gmail &amp; Mobile OTP</w:t>
       </w:r>
     </w:p>
     <w:p>
@@ -1369,7 +1919,7 @@
         <w:drawing>
           <wp:inline xmlns:a="http://schemas.openxmlformats.org/drawingml/2006/main" xmlns:pic="http://schemas.openxmlformats.org/drawingml/2006/picture">
             <wp:extent cx="5852160" cy="2296417"/>
-            <wp:docPr id="3" name="Picture 3"/>
+            <wp:docPr id="4" name="Picture 4"/>
             <wp:cNvGraphicFramePr>
               <a:graphicFrameLocks noChangeAspect="1"/>
             </wp:cNvGraphicFramePr>
@@ -1381,7 +1931,7 @@
                     <pic:cNvPicPr/>
                   </pic:nvPicPr>
                   <pic:blipFill>
-                    <a:blip r:embed="rId13"/>
+                    <a:blip r:embed="rId14"/>
                     <a:stretch>
                       <a:fillRect/>
                     </a:stretch>
@@ -1411,7 +1961,7 @@
           <w:color w:val="64748B"/>
           <w:sz w:val="17"/>
         </w:rPr>
-        <w:t>Figure 3: Dual Authentication Pipeline &amp; User Personalization State Machine</w:t>
+        <w:t>Figure 4: Dual Authentication Pipeline &amp; User Personalization State Machine</w:t>
       </w:r>
     </w:p>
     <w:tbl>
@@ -1745,7 +2295,7 @@
           <w:color w:val="0F172A"/>
           <w:sz w:val="32"/>
         </w:rPr>
-        <w:t>5. Play Store &amp; App Store Distribution Architecture</w:t>
+        <w:t>6. Play Store &amp; App Store Distribution Architecture</w:t>
       </w:r>
     </w:p>
     <w:p>
@@ -1763,7 +2313,7 @@
         <w:drawing>
           <wp:inline xmlns:a="http://schemas.openxmlformats.org/drawingml/2006/main" xmlns:pic="http://schemas.openxmlformats.org/drawingml/2006/picture">
             <wp:extent cx="5852160" cy="2296417"/>
-            <wp:docPr id="4" name="Picture 4"/>
+            <wp:docPr id="5" name="Picture 5"/>
             <wp:cNvGraphicFramePr>
               <a:graphicFrameLocks noChangeAspect="1"/>
             </wp:cNvGraphicFramePr>
@@ -1775,7 +2325,7 @@
                     <pic:cNvPicPr/>
                   </pic:nvPicPr>
                   <pic:blipFill>
-                    <a:blip r:embed="rId14"/>
+                    <a:blip r:embed="rId15"/>
                     <a:stretch>
                       <a:fillRect/>
                     </a:stretch>
@@ -1805,7 +2355,7 @@
           <w:color w:val="64748B"/>
           <w:sz w:val="17"/>
         </w:rPr>
-        <w:t>Figure 4: Google Play Store &amp; Apple App Store Packaging and Release Architecture</w:t>
+        <w:t>Figure 5: Google Play Store &amp; Apple App Store Packaging and Release Architecture</w:t>
       </w:r>
     </w:p>
     <w:tbl>
@@ -1882,7 +2432,7 @@
           <w:color w:val="0F172A"/>
           <w:sz w:val="32"/>
         </w:rPr>
-        <w:t>6. User Installation Steps &amp; Technology Stack</w:t>
+        <w:t>7. User Installation Steps &amp; Technology Stack</w:t>
       </w:r>
     </w:p>
     <w:tbl>

</xml_diff>

<commit_message>
feat(presentation): upgrade presentation document with 300-DPI cinematic visuals and dark HUD graphics
</commit_message>
<xml_diff>
--- a/agents/namma-traffic-agent/Namma_Travel_App_Presentation.docx
+++ b/agents/namma-traffic-agent/Namma_Travel_App_Presentation.docx
@@ -2,32 +2,77 @@
 <file path=word/document.xml><?xml version="1.0" encoding="utf-8"?>
 <w:document xmlns:wpc="http://schemas.microsoft.com/office/word/2010/wordprocessingCanvas" xmlns:mo="http://schemas.microsoft.com/office/mac/office/2008/main" xmlns:mc="http://schemas.openxmlformats.org/markup-compatibility/2006" xmlns:mv="urn:schemas-microsoft-com:mac:vml" xmlns:o="urn:schemas-microsoft-com:office:office" xmlns:r="http://schemas.openxmlformats.org/officeDocument/2006/relationships" xmlns:m="http://schemas.openxmlformats.org/officeDocument/2006/math" xmlns:v="urn:schemas-microsoft-com:vml" xmlns:wp14="http://schemas.microsoft.com/office/word/2010/wordprocessingDrawing" xmlns:wp="http://schemas.openxmlformats.org/drawingml/2006/wordprocessingDrawing" xmlns:w10="urn:schemas-microsoft-com:office:word" xmlns:w="http://schemas.openxmlformats.org/wordprocessingml/2006/main" xmlns:w14="http://schemas.microsoft.com/office/word/2010/wordml" xmlns:wpg="http://schemas.microsoft.com/office/word/2010/wordprocessingGroup" xmlns:wpi="http://schemas.microsoft.com/office/word/2010/wordprocessingInk" xmlns:wne="http://schemas.microsoft.com/office/word/2006/wordml" xmlns:wps="http://schemas.microsoft.com/office/word/2010/wordprocessingShape" mc:Ignorable="w14 wp14">
   <w:body>
+    <w:tbl>
+      <w:tblPr>
+        <w:tblW w:type="auto" w:w="0"/>
+        <w:jc w:val="center"/>
+        <w:tblLayout w:type="fixed"/>
+        <w:tblLook w:firstColumn="1" w:firstRow="1" w:lastColumn="0" w:lastRow="0" w:noHBand="0" w:noVBand="1" w:val="04A0"/>
+      </w:tblPr>
+      <w:tblGrid>
+        <w:gridCol w:w="9360"/>
+      </w:tblGrid>
+      <w:tr>
+        <w:tc>
+          <w:tcPr>
+            <w:tcW w:type="dxa" w:w="9936"/>
+            <w:shd w:fill="070B19"/>
+            <w:tcMar>
+              <w:top w:w="260" w:type="dxa"/>
+              <w:bottom w:w="260" w:type="dxa"/>
+              <w:left w:w="240" w:type="dxa"/>
+              <w:right w:w="240" w:type="dxa"/>
+            </w:tcMar>
+          </w:tcPr>
+          <w:p>
+            <w:pPr>
+              <w:spacing w:before="80" w:after="40"/>
+            </w:pPr>
+            <w:r>
+              <w:rPr>
+                <w:rFonts w:ascii="Calibri" w:hAnsi="Calibri"/>
+                <w:b/>
+                <w:color w:val="38BDF8"/>
+                <w:sz w:val="20"/>
+              </w:rPr>
+              <w:t>BENGALURU MULTIMODAL TRANSIT INTELLIGENCE</w:t>
+              <w:br/>
+            </w:r>
+            <w:r>
+              <w:rPr>
+                <w:rFonts w:ascii="Calibri" w:hAnsi="Calibri"/>
+                <w:b/>
+                <w:color w:val="FFFFFF"/>
+                <w:sz w:val="56"/>
+              </w:rPr>
+              <w:t>🚀 NAMMA TRAVEL</w:t>
+              <w:br/>
+            </w:r>
+            <w:r>
+              <w:rPr>
+                <w:rFonts w:ascii="Calibri" w:hAnsi="Calibri"/>
+                <w:color w:val="C084FC"/>
+                <w:sz w:val="26"/>
+              </w:rPr>
+              <w:t>Autonomous AI Commute Strategist &amp; Cross-Platform Mobile App</w:t>
+              <w:br/>
+            </w:r>
+            <w:r>
+              <w:rPr>
+                <w:rFonts w:ascii="Calibri" w:hAnsi="Calibri"/>
+                <w:color w:val="94A3B8"/>
+                <w:sz w:val="19"/>
+              </w:rPr>
+              <w:t>Powered by Google Gemini 2.5 Flash GenAI SDK • Android Play Store (.aab) &amp; Apple iOS Capacitor • Dual Gmail SSO &amp; Mobile +91 OTP Authentication • Real-Time Bengaluru Bottleneck Bypass</w:t>
+            </w:r>
+          </w:p>
+        </w:tc>
+      </w:tr>
+    </w:tbl>
     <w:p>
       <w:pPr>
-        <w:spacing w:before="240" w:after="80"/>
+        <w:spacing w:after="200"/>
       </w:pPr>
-      <w:r>
-        <w:rPr>
-          <w:rFonts w:ascii="Calibri" w:hAnsi="Calibri"/>
-          <w:b/>
-          <w:color w:val="1A73E8"/>
-          <w:sz w:val="52"/>
-        </w:rPr>
-        <w:t>📱 Namma Travel</w:t>
-      </w:r>
-    </w:p>
-    <w:p>
-      <w:pPr>
-        <w:spacing w:after="280"/>
-      </w:pPr>
-      <w:r>
-        <w:rPr>
-          <w:rFonts w:ascii="Calibri" w:hAnsi="Calibri"/>
-          <w:color w:val="475569"/>
-          <w:sz w:val="28"/>
-        </w:rPr>
-        <w:t>Cross-Platform Mobile Transit &amp; Fare Optimizer for Android &amp; iPhone</w:t>
-      </w:r>
     </w:p>
     <w:tbl>
       <w:tblPr>
@@ -37,20 +82,97 @@
         <w:tblLook w:firstColumn="1" w:firstRow="1" w:lastColumn="0" w:lastRow="0" w:noHBand="0" w:noVBand="1" w:val="04A0"/>
       </w:tblPr>
       <w:tblGrid>
-        <w:gridCol w:w="3168"/>
-        <w:gridCol w:w="3168"/>
-        <w:gridCol w:w="3168"/>
+        <w:gridCol w:w="3110"/>
+        <w:gridCol w:w="3110"/>
+        <w:gridCol w:w="3110"/>
       </w:tblGrid>
       <w:tr>
         <w:tc>
           <w:tcPr>
             <w:tcW w:type="dxa" w:w="3312"/>
-            <w:shd w:fill="1A73E8"/>
+            <w:shd w:fill="0F172A"/>
             <w:tcMar>
-              <w:top w:w="80" w:type="dxa"/>
-              <w:bottom w:w="80" w:type="dxa"/>
-              <w:left w:w="100" w:type="dxa"/>
-              <w:right w:w="100" w:type="dxa"/>
+              <w:top w:w="70" w:type="dxa"/>
+              <w:bottom w:w="70" w:type="dxa"/>
+              <w:left w:w="90" w:type="dxa"/>
+              <w:right w:w="90" w:type="dxa"/>
+            </w:tcMar>
+          </w:tcPr>
+          <w:p>
+            <w:pPr>
+              <w:jc w:val="center"/>
+            </w:pPr>
+            <w:r>
+              <w:rPr>
+                <w:b/>
+                <w:color w:val="38BDF8"/>
+                <w:sz w:val="16"/>
+              </w:rPr>
+              <w:t>AI REASONING CORE</w:t>
+            </w:r>
+          </w:p>
+        </w:tc>
+        <w:tc>
+          <w:tcPr>
+            <w:tcW w:type="dxa" w:w="3312"/>
+            <w:shd w:fill="0F172A"/>
+            <w:tcMar>
+              <w:top w:w="70" w:type="dxa"/>
+              <w:bottom w:w="70" w:type="dxa"/>
+              <w:left w:w="90" w:type="dxa"/>
+              <w:right w:w="90" w:type="dxa"/>
+            </w:tcMar>
+          </w:tcPr>
+          <w:p>
+            <w:pPr>
+              <w:jc w:val="center"/>
+            </w:pPr>
+            <w:r>
+              <w:rPr>
+                <w:b/>
+                <w:color w:val="38BDF8"/>
+                <w:sz w:val="16"/>
+              </w:rPr>
+              <w:t>MOBILE DEPLOYMENT</w:t>
+            </w:r>
+          </w:p>
+        </w:tc>
+        <w:tc>
+          <w:tcPr>
+            <w:tcW w:type="dxa" w:w="3312"/>
+            <w:shd w:fill="0F172A"/>
+            <w:tcMar>
+              <w:top w:w="70" w:type="dxa"/>
+              <w:bottom w:w="70" w:type="dxa"/>
+              <w:left w:w="90" w:type="dxa"/>
+              <w:right w:w="90" w:type="dxa"/>
+            </w:tcMar>
+          </w:tcPr>
+          <w:p>
+            <w:pPr>
+              <w:jc w:val="center"/>
+            </w:pPr>
+            <w:r>
+              <w:rPr>
+                <w:b/>
+                <w:color w:val="38BDF8"/>
+                <w:sz w:val="16"/>
+              </w:rPr>
+              <w:t>USER AUTHENTICATION</w:t>
+            </w:r>
+          </w:p>
+        </w:tc>
+      </w:tr>
+      <w:tr>
+        <w:tc>
+          <w:tcPr>
+            <w:tcW w:type="dxa" w:w="3312"/>
+            <w:shd w:fill="1E293B"/>
+            <w:tcMar>
+              <w:top w:w="70" w:type="dxa"/>
+              <w:bottom w:w="70" w:type="dxa"/>
+              <w:left w:w="90" w:type="dxa"/>
+              <w:right w:w="90" w:type="dxa"/>
             </w:tcMar>
           </w:tcPr>
           <w:p>
@@ -61,21 +183,21 @@
               <w:rPr>
                 <w:b/>
                 <w:color w:val="FFFFFF"/>
-                <w:sz w:val="16"/>
+                <w:sz w:val="17"/>
               </w:rPr>
-              <w:t>TARGET PLATFORMS</w:t>
+              <w:t>Google Gemini 2.5 Flash</w:t>
             </w:r>
           </w:p>
         </w:tc>
         <w:tc>
           <w:tcPr>
             <w:tcW w:type="dxa" w:w="3312"/>
-            <w:shd w:fill="1A73E8"/>
+            <w:shd w:fill="1E293B"/>
             <w:tcMar>
-              <w:top w:w="80" w:type="dxa"/>
-              <w:bottom w:w="80" w:type="dxa"/>
-              <w:left w:w="100" w:type="dxa"/>
-              <w:right w:w="100" w:type="dxa"/>
+              <w:top w:w="70" w:type="dxa"/>
+              <w:bottom w:w="70" w:type="dxa"/>
+              <w:left w:w="90" w:type="dxa"/>
+              <w:right w:w="90" w:type="dxa"/>
             </w:tcMar>
           </w:tcPr>
           <w:p>
@@ -86,21 +208,21 @@
               <w:rPr>
                 <w:b/>
                 <w:color w:val="FFFFFF"/>
-                <w:sz w:val="16"/>
+                <w:sz w:val="17"/>
               </w:rPr>
-              <w:t>AUTH &amp; INTEGRATION</w:t>
+              <w:t>Android Play Store &amp; iOS</w:t>
             </w:r>
           </w:p>
         </w:tc>
         <w:tc>
           <w:tcPr>
             <w:tcW w:type="dxa" w:w="3312"/>
-            <w:shd w:fill="1A73E8"/>
+            <w:shd w:fill="1E293B"/>
             <w:tcMar>
-              <w:top w:w="80" w:type="dxa"/>
-              <w:bottom w:w="80" w:type="dxa"/>
-              <w:left w:w="100" w:type="dxa"/>
-              <w:right w:w="100" w:type="dxa"/>
+              <w:top w:w="70" w:type="dxa"/>
+              <w:bottom w:w="70" w:type="dxa"/>
+              <w:left w:w="90" w:type="dxa"/>
+              <w:right w:w="90" w:type="dxa"/>
             </w:tcMar>
           </w:tcPr>
           <w:p>
@@ -111,86 +233,9 @@
               <w:rPr>
                 <w:b/>
                 <w:color w:val="FFFFFF"/>
-                <w:sz w:val="16"/>
-              </w:rPr>
-              <w:t>APPLICATION ID</w:t>
-            </w:r>
-          </w:p>
-        </w:tc>
-      </w:tr>
-      <w:tr>
-        <w:tc>
-          <w:tcPr>
-            <w:tcW w:type="dxa" w:w="3312"/>
-            <w:shd w:fill="F8FAFC"/>
-            <w:tcMar>
-              <w:top w:w="80" w:type="dxa"/>
-              <w:bottom w:w="80" w:type="dxa"/>
-              <w:left w:w="100" w:type="dxa"/>
-              <w:right w:w="100" w:type="dxa"/>
-            </w:tcMar>
-          </w:tcPr>
-          <w:p>
-            <w:pPr>
-              <w:jc w:val="center"/>
-            </w:pPr>
-            <w:r>
-              <w:rPr>
-                <w:b/>
-                <w:color w:val="0F172A"/>
                 <w:sz w:val="17"/>
               </w:rPr>
-              <w:t>Android (Play Store) &amp; iOS (App Store)</w:t>
-            </w:r>
-          </w:p>
-        </w:tc>
-        <w:tc>
-          <w:tcPr>
-            <w:tcW w:type="dxa" w:w="3312"/>
-            <w:shd w:fill="F8FAFC"/>
-            <w:tcMar>
-              <w:top w:w="80" w:type="dxa"/>
-              <w:bottom w:w="80" w:type="dxa"/>
-              <w:left w:w="100" w:type="dxa"/>
-              <w:right w:w="100" w:type="dxa"/>
-            </w:tcMar>
-          </w:tcPr>
-          <w:p>
-            <w:pPr>
-              <w:jc w:val="center"/>
-            </w:pPr>
-            <w:r>
-              <w:rPr>
-                <w:b/>
-                <w:color w:val="0F172A"/>
-                <w:sz w:val="17"/>
-              </w:rPr>
-              <w:t>Gmail OAuth + Mobile OTP (+91)</w:t>
-            </w:r>
-          </w:p>
-        </w:tc>
-        <w:tc>
-          <w:tcPr>
-            <w:tcW w:type="dxa" w:w="3312"/>
-            <w:shd w:fill="F8FAFC"/>
-            <w:tcMar>
-              <w:top w:w="80" w:type="dxa"/>
-              <w:bottom w:w="80" w:type="dxa"/>
-              <w:left w:w="100" w:type="dxa"/>
-              <w:right w:w="100" w:type="dxa"/>
-            </w:tcMar>
-          </w:tcPr>
-          <w:p>
-            <w:pPr>
-              <w:jc w:val="center"/>
-            </w:pPr>
-            <w:r>
-              <w:rPr>
-                <w:b/>
-                <w:color w:val="0F172A"/>
-                <w:sz w:val="17"/>
-              </w:rPr>
-              <w:t>com.nammatraffic.travelapp</w:t>
+              <w:t>Gmail OAuth + Mobile OTP</w:t>
             </w:r>
           </w:p>
         </w:tc>
@@ -198,7 +243,7 @@
     </w:tbl>
     <w:p>
       <w:pPr>
-        <w:spacing w:after="200"/>
+        <w:spacing w:after="240"/>
       </w:pPr>
     </w:p>
     <w:p>
@@ -212,12 +257,12 @@
           <w:color w:val="0F172A"/>
           <w:sz w:val="32"/>
         </w:rPr>
-        <w:t>1. Executive Summary &amp; Urban Commute Problem</w:t>
+        <w:t>1. The Bengaluru Urban Crisis &amp; The AI Imperative</w:t>
       </w:r>
     </w:p>
     <w:p>
       <w:r>
-        <w:t>Bengaluru commuters spend an average of 2.5 hours daily navigating severe traffic bottlenecks across the Outer Ring Road, Silk Board Junction, Tin Factory, and Whitefield. This congestion inflicts an estimated annual productivity loss of ₹19,700 Crores on the city economy. Existing single-mode ride apps push surge-priced cabs, while transit schedules for Namma Metro and BMTC buses remain fragmented.</w:t>
+        <w:t>Bengaluru commuters spend an average of 2.5 hours every single day locked in gridlock along the tech corridors of Outer Ring Road, Silk Board, Tin Factory, and Whitefield. This paralysis inflicts an estimated annual productivity loss of ₹19,700 Crores on Karnataka's IT hub. Existing navigation systems act purely as reactive speedometers—alerting commuters only when they are already stranded in bumper-to-bumper delays.</w:t>
       </w:r>
     </w:p>
     <w:tbl>
@@ -234,7 +279,7 @@
         <w:tc>
           <w:tcPr>
             <w:tcW w:type="dxa" w:w="9936"/>
-            <w:shd w:fill="EFF6FF"/>
+            <w:shd w:fill="0F172A"/>
             <w:tcMar>
               <w:top w:w="140" w:type="dxa"/>
               <w:bottom w:w="140" w:type="dxa"/>
@@ -243,7 +288,7 @@
             </w:tcMar>
             <w:tcBorders>
               <w:top w:val="none"/>
-              <w:left w:val="single" w:sz="24" w:space="0" w:color="1A73E8"/>
+              <w:left w:val="single" w:sz="28" w:space="0" w:color="38BDF8"/>
               <w:bottom w:val="none"/>
               <w:right w:val="none"/>
             </w:tcBorders>
@@ -256,19 +301,19 @@
               <w:rPr>
                 <w:rFonts w:ascii="Calibri" w:hAnsi="Calibri"/>
                 <w:b/>
-                <w:color w:val="1A73E8"/>
-                <w:sz w:val="21"/>
+                <w:color w:val="38BDF8"/>
+                <w:sz w:val="22"/>
               </w:rPr>
-              <w:t>📌 Core Solution: Namma Travel App</w:t>
+              <w:t>⚡ The Namma Travel Paradigm Shift</w:t>
               <w:br/>
             </w:r>
             <w:r>
               <w:rPr>
                 <w:rFonts w:ascii="Calibri" w:hAnsi="Calibri"/>
-                <w:color w:val="334155"/>
+                <w:color w:val="E2E8F0"/>
                 <w:sz w:val="19"/>
               </w:rPr>
-              <w:t>An AI-orchestrated multimodal travel companion delivering real-time fare optimization, live Metro Purple/Green/Yellow tracking, BMTC Ordinary vs AC bus comparisons, dynamic Ola/Uber surge warnings, and single-click Android/iOS native deployment.</w:t>
+              <w:t>Namma Travel transforms commute planning from passive mapping to proactive, multimodal strategy. By fusing Google Gemini 2.5 Flash reasoning with local corridor intelligence, the agent dynamically recommends optimal departure windows, prevents ₹700+ surge cab rip-offs, and routes users onto Namma Metro and BMTC Volvo lines.</w:t>
             </w:r>
           </w:p>
         </w:tc>
@@ -290,17 +335,16 @@
           <w:color w:val="0F172A"/>
           <w:sz w:val="32"/>
         </w:rPr>
-        <w:t>2. Namma Travel AI Agent Architecture &amp; Autonomous Reasoning</w:t>
+        <w:t>2. Namma Travel AI Agent Architecture &amp; Reasoning Flow</w:t>
       </w:r>
     </w:p>
     <w:p>
       <w:r>
-        <w:t>At the core of Namma Travel is an autonomous transit intelligence agent (NammaTrafficAgent) powered by Google GenAI (Gemini 2.5 Flash SDK) with dynamic tool-calling reasoning and a deterministic local transit heuristics engine. The agent deciphers natural language commute queries, selects the most relevant transit tools, and synthesizes actionable departure and fare-saving advice:</w:t>
+        <w:t>The agent implements a two-tier execution engine: when network connectivity and API keys are available, it engages Google GenAI (Gemini 2.5 Flash) with dynamic tool schema declarations. In low-connectivity environments (such as subway stations), it immediately cascades to a deterministic local transit heuristics engine, guaranteeing 100% uninterrupted operation:</w:t>
       </w:r>
     </w:p>
     <w:p>
       <w:pPr>
-        <w:spacing w:after="80"/>
         <w:jc w:val="center"/>
       </w:pPr>
     </w:p>
@@ -308,7 +352,7 @@
       <w:r>
         <w:drawing>
           <wp:inline xmlns:a="http://schemas.openxmlformats.org/drawingml/2006/main" xmlns:pic="http://schemas.openxmlformats.org/drawingml/2006/picture">
-            <wp:extent cx="5943600" cy="3042557"/>
+            <wp:extent cx="5943600" cy="3069771"/>
             <wp:docPr id="1" name="Picture 1"/>
             <wp:cNvGraphicFramePr>
               <a:graphicFrameLocks noChangeAspect="1"/>
@@ -317,7 +361,7 @@
               <a:graphicData uri="http://schemas.openxmlformats.org/drawingml/2006/picture">
                 <pic:pic>
                   <pic:nvPicPr>
-                    <pic:cNvPr id="0" name="ai_agent_architecture.png"/>
+                    <pic:cNvPr id="0" name="ai_agent_architecture_cinematic.png"/>
                     <pic:cNvPicPr/>
                   </pic:nvPicPr>
                   <pic:blipFill>
@@ -329,7 +373,7 @@
                   <pic:spPr>
                     <a:xfrm>
                       <a:off x="0" y="0"/>
-                      <a:ext cx="5943600" cy="3042557"/>
+                      <a:ext cx="5943600" cy="3069771"/>
                     </a:xfrm>
                     <a:prstGeom prst="rect"/>
                   </pic:spPr>
@@ -351,12 +395,7 @@
           <w:color w:val="64748B"/>
           <w:sz w:val="17"/>
         </w:rPr>
-        <w:t>Figure 1: Autonomous AI Agent Architecture, Tool-Calling Loop, and Specialized Bengaluru Transit Tools</w:t>
-      </w:r>
-    </w:p>
-    <w:p>
-      <w:r>
-        <w:t>Specialized Transit Tools Executed by the AI Agent:</w:t>
+        <w:t>Figure 1: Autonomous AI Agent Architecture, Tool-Calling Loop, and Specialized Bengaluru Transit Satellites</w:t>
       </w:r>
     </w:p>
     <w:tbl>
@@ -375,12 +414,12 @@
         <w:tc>
           <w:tcPr>
             <w:tcW w:type="dxa" w:w="3312"/>
-            <w:shd w:fill="1A73E8"/>
+            <w:shd w:fill="0F172A"/>
             <w:tcMar>
-              <w:top w:w="80" w:type="dxa"/>
-              <w:bottom w:w="80" w:type="dxa"/>
-              <w:left w:w="100" w:type="dxa"/>
-              <w:right w:w="100" w:type="dxa"/>
+              <w:top w:w="70" w:type="dxa"/>
+              <w:bottom w:w="70" w:type="dxa"/>
+              <w:left w:w="90" w:type="dxa"/>
+              <w:right w:w="90" w:type="dxa"/>
             </w:tcMar>
           </w:tcPr>
           <w:p>
@@ -390,22 +429,22 @@
             <w:r>
               <w:rPr>
                 <w:b/>
-                <w:color w:val="FFFFFF"/>
-                <w:sz w:val="17"/>
+                <w:color w:val="38BDF8"/>
+                <w:sz w:val="16"/>
               </w:rPr>
-              <w:t>TOOL NAME</w:t>
+              <w:t>TRANSIT TOOL</w:t>
             </w:r>
           </w:p>
         </w:tc>
         <w:tc>
           <w:tcPr>
             <w:tcW w:type="dxa" w:w="3312"/>
-            <w:shd w:fill="1A73E8"/>
+            <w:shd w:fill="0F172A"/>
             <w:tcMar>
-              <w:top w:w="80" w:type="dxa"/>
-              <w:bottom w:w="80" w:type="dxa"/>
-              <w:left w:w="100" w:type="dxa"/>
-              <w:right w:w="100" w:type="dxa"/>
+              <w:top w:w="70" w:type="dxa"/>
+              <w:bottom w:w="70" w:type="dxa"/>
+              <w:left w:w="90" w:type="dxa"/>
+              <w:right w:w="90" w:type="dxa"/>
             </w:tcMar>
           </w:tcPr>
           <w:p>
@@ -415,22 +454,22 @@
             <w:r>
               <w:rPr>
                 <w:b/>
-                <w:color w:val="FFFFFF"/>
-                <w:sz w:val="17"/>
+                <w:color w:val="38BDF8"/>
+                <w:sz w:val="16"/>
               </w:rPr>
-              <w:t>RESPONSIBILITY</w:t>
+              <w:t>AGENT RESPONSIBILITY</w:t>
             </w:r>
           </w:p>
         </w:tc>
         <w:tc>
           <w:tcPr>
             <w:tcW w:type="dxa" w:w="3312"/>
-            <w:shd w:fill="1A73E8"/>
+            <w:shd w:fill="0F172A"/>
             <w:tcMar>
-              <w:top w:w="80" w:type="dxa"/>
-              <w:bottom w:w="80" w:type="dxa"/>
-              <w:left w:w="100" w:type="dxa"/>
-              <w:right w:w="100" w:type="dxa"/>
+              <w:top w:w="70" w:type="dxa"/>
+              <w:bottom w:w="70" w:type="dxa"/>
+              <w:left w:w="90" w:type="dxa"/>
+              <w:right w:w="90" w:type="dxa"/>
             </w:tcMar>
           </w:tcPr>
           <w:p>
@@ -440,10 +479,10 @@
             <w:r>
               <w:rPr>
                 <w:b/>
-                <w:color w:val="FFFFFF"/>
-                <w:sz w:val="17"/>
+                <w:color w:val="38BDF8"/>
+                <w:sz w:val="16"/>
               </w:rPr>
-              <w:t>BENGALURU LOCAL INTELLIGENCE</w:t>
+              <w:t>LOCAL CORRIDOR INTELLIGENCE</w:t>
             </w:r>
           </w:p>
         </w:tc>
@@ -494,7 +533,7 @@
                 <w:color w:val="0F172A"/>
                 <w:sz w:val="17"/>
               </w:rPr>
-              <w:t>Calculates live road delays &amp; surge multipliers</w:t>
+              <w:t>Calculates live delays &amp; peak surge multipliers</w:t>
             </w:r>
           </w:p>
         </w:tc>
@@ -826,8 +865,13 @@
     </w:tbl>
     <w:p>
       <w:pPr>
-        <w:spacing w:after="160"/>
+        <w:spacing w:after="200"/>
       </w:pPr>
+    </w:p>
+    <w:p>
+      <w:r>
+        <w:br w:type="page"/>
+      </w:r>
     </w:p>
     <w:p>
       <w:pPr>
@@ -840,17 +884,16 @@
           <w:color w:val="0F172A"/>
           <w:sz w:val="32"/>
         </w:rPr>
-        <w:t>3. Multimodal Transit Intelligence &amp; Cost Savings</w:t>
+        <w:t>3. Multimodal Showdown: Cost vs Travel Duration</w:t>
       </w:r>
     </w:p>
     <w:p>
       <w:r>
-        <w:t>Namma Travel App continuously calculates real-time trade-offs between travel duration and commuter out-of-pocket expenses. The chart below demonstrates a typical peak-hour commute from Silk Board Junction to Whitefield IT Hub:</w:t>
+        <w:t>Namma Travel eliminates guesswork by projecting live multimodal trade-offs for any origin-destination pair. The visual benchmark below highlights a typical peak evening trip from Silk Board to Whitefield IT Hub:</w:t>
       </w:r>
     </w:p>
     <w:p>
       <w:pPr>
-        <w:spacing w:after="80"/>
         <w:jc w:val="center"/>
       </w:pPr>
     </w:p>
@@ -858,7 +901,7 @@
       <w:r>
         <w:drawing>
           <wp:inline xmlns:a="http://schemas.openxmlformats.org/drawingml/2006/main" xmlns:pic="http://schemas.openxmlformats.org/drawingml/2006/picture">
-            <wp:extent cx="5852160" cy="3035450"/>
+            <wp:extent cx="5943600" cy="2937642"/>
             <wp:docPr id="2" name="Picture 2"/>
             <wp:cNvGraphicFramePr>
               <a:graphicFrameLocks noChangeAspect="1"/>
@@ -867,7 +910,7 @@
               <a:graphicData uri="http://schemas.openxmlformats.org/drawingml/2006/picture">
                 <pic:pic>
                   <pic:nvPicPr>
-                    <pic:cNvPr id="0" name="fare_vs_time_chart.png"/>
+                    <pic:cNvPr id="0" name="fare_vs_time_cinematic.png"/>
                     <pic:cNvPicPr/>
                   </pic:nvPicPr>
                   <pic:blipFill>
@@ -879,7 +922,7 @@
                   <pic:spPr>
                     <a:xfrm>
                       <a:off x="0" y="0"/>
-                      <a:ext cx="5852160" cy="3035450"/>
+                      <a:ext cx="5943600" cy="2937642"/>
                     </a:xfrm>
                     <a:prstGeom prst="rect"/>
                   </pic:spPr>
@@ -901,12 +944,7 @@
           <w:color w:val="64748B"/>
           <w:sz w:val="17"/>
         </w:rPr>
-        <w:t>Figure 2: Comprehensive Fare vs Travel Time Benchmark across Bengaluru Transit Modes</w:t>
-      </w:r>
-    </w:p>
-    <w:p>
-      <w:r>
-        <w:t>Summary of Commute Modes, Savings, and Comfort Attributes:</w:t>
+        <w:t>Figure 2: Comprehensive Multimodal Fare vs Duration Benchmark across Bengaluru Transit Modes</w:t>
       </w:r>
     </w:p>
     <w:tbl>
@@ -917,831 +955,47 @@
         <w:tblLook w:firstColumn="1" w:firstRow="1" w:lastColumn="0" w:lastRow="0" w:noHBand="0" w:noVBand="1" w:val="04A0"/>
       </w:tblPr>
       <w:tblGrid>
-        <w:gridCol w:w="2304"/>
-        <w:gridCol w:w="1584"/>
-        <w:gridCol w:w="1584"/>
-        <w:gridCol w:w="1728"/>
-        <w:gridCol w:w="2160"/>
+        <w:gridCol w:w="9360"/>
       </w:tblGrid>
       <w:tr>
         <w:tc>
           <w:tcPr>
-            <w:tcW w:type="dxa" w:w="1987"/>
-            <w:shd w:fill="1E293B"/>
+            <w:tcW w:type="dxa" w:w="9936"/>
+            <w:shd w:fill="0F172A"/>
             <w:tcMar>
-              <w:top w:w="80" w:type="dxa"/>
-              <w:bottom w:w="80" w:type="dxa"/>
-              <w:left w:w="100" w:type="dxa"/>
-              <w:right w:w="100" w:type="dxa"/>
+              <w:top w:w="140" w:type="dxa"/>
+              <w:bottom w:w="140" w:type="dxa"/>
+              <w:left w:w="180" w:type="dxa"/>
+              <w:right w:w="180" w:type="dxa"/>
             </w:tcMar>
+            <w:tcBorders>
+              <w:top w:val="none"/>
+              <w:left w:val="single" w:sz="28" w:space="0" w:color="34D399"/>
+              <w:bottom w:val="none"/>
+              <w:right w:val="none"/>
+            </w:tcBorders>
           </w:tcPr>
           <w:p>
             <w:pPr>
-              <w:jc w:val="center"/>
+              <w:spacing w:before="40" w:after="60"/>
             </w:pPr>
             <w:r>
               <w:rPr>
+                <w:rFonts w:ascii="Calibri" w:hAnsi="Calibri"/>
                 <w:b/>
-                <w:color w:val="FFFFFF"/>
-                <w:sz w:val="16"/>
+                <w:color w:val="34D399"/>
+                <w:sz w:val="22"/>
               </w:rPr>
-              <w:t>TRANSIT MODE</w:t>
+              <w:t>⚡ Surge Cab Arbitrage</w:t>
+              <w:br/>
             </w:r>
-          </w:p>
-        </w:tc>
-        <w:tc>
-          <w:tcPr>
-            <w:tcW w:type="dxa" w:w="1987"/>
-            <w:shd w:fill="1E293B"/>
-            <w:tcMar>
-              <w:top w:w="80" w:type="dxa"/>
-              <w:bottom w:w="80" w:type="dxa"/>
-              <w:left w:w="100" w:type="dxa"/>
-              <w:right w:w="100" w:type="dxa"/>
-            </w:tcMar>
-          </w:tcPr>
-          <w:p>
-            <w:pPr>
-              <w:jc w:val="center"/>
-            </w:pPr>
             <w:r>
               <w:rPr>
-                <w:b/>
-                <w:color w:val="FFFFFF"/>
-                <w:sz w:val="16"/>
+                <w:rFonts w:ascii="Calibri" w:hAnsi="Calibri"/>
+                <w:color w:val="E2E8F0"/>
+                <w:sz w:val="19"/>
               </w:rPr>
-              <w:t>FARE (₹)</w:t>
-            </w:r>
-          </w:p>
-        </w:tc>
-        <w:tc>
-          <w:tcPr>
-            <w:tcW w:type="dxa" w:w="1987"/>
-            <w:shd w:fill="1E293B"/>
-            <w:tcMar>
-              <w:top w:w="80" w:type="dxa"/>
-              <w:bottom w:w="80" w:type="dxa"/>
-              <w:left w:w="100" w:type="dxa"/>
-              <w:right w:w="100" w:type="dxa"/>
-            </w:tcMar>
-          </w:tcPr>
-          <w:p>
-            <w:pPr>
-              <w:jc w:val="center"/>
-            </w:pPr>
-            <w:r>
-              <w:rPr>
-                <w:b/>
-                <w:color w:val="FFFFFF"/>
-                <w:sz w:val="16"/>
-              </w:rPr>
-              <w:t>TIME (MIN)</w:t>
-            </w:r>
-          </w:p>
-        </w:tc>
-        <w:tc>
-          <w:tcPr>
-            <w:tcW w:type="dxa" w:w="1987"/>
-            <w:shd w:fill="1E293B"/>
-            <w:tcMar>
-              <w:top w:w="80" w:type="dxa"/>
-              <w:bottom w:w="80" w:type="dxa"/>
-              <w:left w:w="100" w:type="dxa"/>
-              <w:right w:w="100" w:type="dxa"/>
-            </w:tcMar>
-          </w:tcPr>
-          <w:p>
-            <w:pPr>
-              <w:jc w:val="center"/>
-            </w:pPr>
-            <w:r>
-              <w:rPr>
-                <w:b/>
-                <w:color w:val="FFFFFF"/>
-                <w:sz w:val="16"/>
-              </w:rPr>
-              <w:t>SURGE RESISTANT</w:t>
-            </w:r>
-          </w:p>
-        </w:tc>
-        <w:tc>
-          <w:tcPr>
-            <w:tcW w:type="dxa" w:w="1987"/>
-            <w:shd w:fill="1E293B"/>
-            <w:tcMar>
-              <w:top w:w="80" w:type="dxa"/>
-              <w:bottom w:w="80" w:type="dxa"/>
-              <w:left w:w="100" w:type="dxa"/>
-              <w:right w:w="100" w:type="dxa"/>
-            </w:tcMar>
-          </w:tcPr>
-          <w:p>
-            <w:pPr>
-              <w:jc w:val="center"/>
-            </w:pPr>
-            <w:r>
-              <w:rPr>
-                <w:b/>
-                <w:color w:val="FFFFFF"/>
-                <w:sz w:val="16"/>
-              </w:rPr>
-              <w:t>RECOMMENDED FOR</w:t>
-            </w:r>
-          </w:p>
-        </w:tc>
-      </w:tr>
-      <w:tr>
-        <w:tc>
-          <w:tcPr>
-            <w:tcW w:type="dxa" w:w="1987"/>
-            <w:shd w:fill="FFFFFF"/>
-            <w:tcMar>
-              <w:top w:w="60" w:type="dxa"/>
-              <w:bottom w:w="60" w:type="dxa"/>
-              <w:left w:w="80" w:type="dxa"/>
-              <w:right w:w="80" w:type="dxa"/>
-            </w:tcMar>
-          </w:tcPr>
-          <w:p>
-            <w:r>
-              <w:rPr>
-                <w:color w:val="0F172A"/>
-                <w:sz w:val="17"/>
-              </w:rPr>
-              <w:t>Namma Metro (Purple)</w:t>
-            </w:r>
-          </w:p>
-        </w:tc>
-        <w:tc>
-          <w:tcPr>
-            <w:tcW w:type="dxa" w:w="1987"/>
-            <w:shd w:fill="FFFFFF"/>
-            <w:tcMar>
-              <w:top w:w="60" w:type="dxa"/>
-              <w:bottom w:w="60" w:type="dxa"/>
-              <w:left w:w="80" w:type="dxa"/>
-              <w:right w:w="80" w:type="dxa"/>
-            </w:tcMar>
-          </w:tcPr>
-          <w:p>
-            <w:pPr>
-              <w:jc w:val="center"/>
-            </w:pPr>
-            <w:r>
-              <w:rPr>
-                <w:color w:val="0F172A"/>
-                <w:sz w:val="17"/>
-              </w:rPr>
-              <w:t>₹35</w:t>
-            </w:r>
-          </w:p>
-        </w:tc>
-        <w:tc>
-          <w:tcPr>
-            <w:tcW w:type="dxa" w:w="1987"/>
-            <w:shd w:fill="FFFFFF"/>
-            <w:tcMar>
-              <w:top w:w="60" w:type="dxa"/>
-              <w:bottom w:w="60" w:type="dxa"/>
-              <w:left w:w="80" w:type="dxa"/>
-              <w:right w:w="80" w:type="dxa"/>
-            </w:tcMar>
-          </w:tcPr>
-          <w:p>
-            <w:pPr>
-              <w:jc w:val="center"/>
-            </w:pPr>
-            <w:r>
-              <w:rPr>
-                <w:color w:val="0F172A"/>
-                <w:sz w:val="17"/>
-              </w:rPr>
-              <w:t>28 mins</w:t>
-            </w:r>
-          </w:p>
-        </w:tc>
-        <w:tc>
-          <w:tcPr>
-            <w:tcW w:type="dxa" w:w="1987"/>
-            <w:shd w:fill="FFFFFF"/>
-            <w:tcMar>
-              <w:top w:w="60" w:type="dxa"/>
-              <w:bottom w:w="60" w:type="dxa"/>
-              <w:left w:w="80" w:type="dxa"/>
-              <w:right w:w="80" w:type="dxa"/>
-            </w:tcMar>
-          </w:tcPr>
-          <w:p>
-            <w:pPr>
-              <w:jc w:val="center"/>
-            </w:pPr>
-            <w:r>
-              <w:rPr>
-                <w:color w:val="0F172A"/>
-                <w:sz w:val="17"/>
-              </w:rPr>
-              <w:t>✅ 100% Guaranteed</w:t>
-            </w:r>
-          </w:p>
-        </w:tc>
-        <w:tc>
-          <w:tcPr>
-            <w:tcW w:type="dxa" w:w="1987"/>
-            <w:shd w:fill="FFFFFF"/>
-            <w:tcMar>
-              <w:top w:w="60" w:type="dxa"/>
-              <w:bottom w:w="60" w:type="dxa"/>
-              <w:left w:w="80" w:type="dxa"/>
-              <w:right w:w="80" w:type="dxa"/>
-            </w:tcMar>
-          </w:tcPr>
-          <w:p>
-            <w:r>
-              <w:rPr>
-                <w:color w:val="0F172A"/>
-                <w:sz w:val="17"/>
-              </w:rPr>
-              <w:t>Fastest peak commute</w:t>
-            </w:r>
-          </w:p>
-        </w:tc>
-      </w:tr>
-      <w:tr>
-        <w:tc>
-          <w:tcPr>
-            <w:tcW w:type="dxa" w:w="1987"/>
-            <w:shd w:fill="F8FAFC"/>
-            <w:tcMar>
-              <w:top w:w="60" w:type="dxa"/>
-              <w:bottom w:w="60" w:type="dxa"/>
-              <w:left w:w="80" w:type="dxa"/>
-              <w:right w:w="80" w:type="dxa"/>
-            </w:tcMar>
-          </w:tcPr>
-          <w:p>
-            <w:r>
-              <w:rPr>
-                <w:color w:val="0F172A"/>
-                <w:sz w:val="17"/>
-              </w:rPr>
-              <w:t>BMTC Vajra (Volvo AC)</w:t>
-            </w:r>
-          </w:p>
-        </w:tc>
-        <w:tc>
-          <w:tcPr>
-            <w:tcW w:type="dxa" w:w="1987"/>
-            <w:shd w:fill="F8FAFC"/>
-            <w:tcMar>
-              <w:top w:w="60" w:type="dxa"/>
-              <w:bottom w:w="60" w:type="dxa"/>
-              <w:left w:w="80" w:type="dxa"/>
-              <w:right w:w="80" w:type="dxa"/>
-            </w:tcMar>
-          </w:tcPr>
-          <w:p>
-            <w:pPr>
-              <w:jc w:val="center"/>
-            </w:pPr>
-            <w:r>
-              <w:rPr>
-                <w:color w:val="0F172A"/>
-                <w:sz w:val="17"/>
-              </w:rPr>
-              <w:t>₹60</w:t>
-            </w:r>
-          </w:p>
-        </w:tc>
-        <w:tc>
-          <w:tcPr>
-            <w:tcW w:type="dxa" w:w="1987"/>
-            <w:shd w:fill="F8FAFC"/>
-            <w:tcMar>
-              <w:top w:w="60" w:type="dxa"/>
-              <w:bottom w:w="60" w:type="dxa"/>
-              <w:left w:w="80" w:type="dxa"/>
-              <w:right w:w="80" w:type="dxa"/>
-            </w:tcMar>
-          </w:tcPr>
-          <w:p>
-            <w:pPr>
-              <w:jc w:val="center"/>
-            </w:pPr>
-            <w:r>
-              <w:rPr>
-                <w:color w:val="0F172A"/>
-                <w:sz w:val="17"/>
-              </w:rPr>
-              <w:t>38 mins</w:t>
-            </w:r>
-          </w:p>
-        </w:tc>
-        <w:tc>
-          <w:tcPr>
-            <w:tcW w:type="dxa" w:w="1987"/>
-            <w:shd w:fill="F8FAFC"/>
-            <w:tcMar>
-              <w:top w:w="60" w:type="dxa"/>
-              <w:bottom w:w="60" w:type="dxa"/>
-              <w:left w:w="80" w:type="dxa"/>
-              <w:right w:w="80" w:type="dxa"/>
-            </w:tcMar>
-          </w:tcPr>
-          <w:p>
-            <w:pPr>
-              <w:jc w:val="center"/>
-            </w:pPr>
-            <w:r>
-              <w:rPr>
-                <w:color w:val="0F172A"/>
-                <w:sz w:val="17"/>
-              </w:rPr>
-              <w:t>✅ Fixed Tariff</w:t>
-            </w:r>
-          </w:p>
-        </w:tc>
-        <w:tc>
-          <w:tcPr>
-            <w:tcW w:type="dxa" w:w="1987"/>
-            <w:shd w:fill="F8FAFC"/>
-            <w:tcMar>
-              <w:top w:w="60" w:type="dxa"/>
-              <w:bottom w:w="60" w:type="dxa"/>
-              <w:left w:w="80" w:type="dxa"/>
-              <w:right w:w="80" w:type="dxa"/>
-            </w:tcMar>
-          </w:tcPr>
-          <w:p>
-            <w:r>
-              <w:rPr>
-                <w:color w:val="0F172A"/>
-                <w:sz w:val="17"/>
-              </w:rPr>
-              <w:t>Comfortable tech corridor</w:t>
-            </w:r>
-          </w:p>
-        </w:tc>
-      </w:tr>
-      <w:tr>
-        <w:tc>
-          <w:tcPr>
-            <w:tcW w:type="dxa" w:w="1987"/>
-            <w:shd w:fill="FFFFFF"/>
-            <w:tcMar>
-              <w:top w:w="60" w:type="dxa"/>
-              <w:bottom w:w="60" w:type="dxa"/>
-              <w:left w:w="80" w:type="dxa"/>
-              <w:right w:w="80" w:type="dxa"/>
-            </w:tcMar>
-          </w:tcPr>
-          <w:p>
-            <w:r>
-              <w:rPr>
-                <w:color w:val="0F172A"/>
-                <w:sz w:val="17"/>
-              </w:rPr>
-              <w:t>BMTC Ordinary (500-D)</w:t>
-            </w:r>
-          </w:p>
-        </w:tc>
-        <w:tc>
-          <w:tcPr>
-            <w:tcW w:type="dxa" w:w="1987"/>
-            <w:shd w:fill="FFFFFF"/>
-            <w:tcMar>
-              <w:top w:w="60" w:type="dxa"/>
-              <w:bottom w:w="60" w:type="dxa"/>
-              <w:left w:w="80" w:type="dxa"/>
-              <w:right w:w="80" w:type="dxa"/>
-            </w:tcMar>
-          </w:tcPr>
-          <w:p>
-            <w:pPr>
-              <w:jc w:val="center"/>
-            </w:pPr>
-            <w:r>
-              <w:rPr>
-                <w:color w:val="0F172A"/>
-                <w:sz w:val="17"/>
-              </w:rPr>
-              <w:t>₹25</w:t>
-            </w:r>
-          </w:p>
-        </w:tc>
-        <w:tc>
-          <w:tcPr>
-            <w:tcW w:type="dxa" w:w="1987"/>
-            <w:shd w:fill="FFFFFF"/>
-            <w:tcMar>
-              <w:top w:w="60" w:type="dxa"/>
-              <w:bottom w:w="60" w:type="dxa"/>
-              <w:left w:w="80" w:type="dxa"/>
-              <w:right w:w="80" w:type="dxa"/>
-            </w:tcMar>
-          </w:tcPr>
-          <w:p>
-            <w:pPr>
-              <w:jc w:val="center"/>
-            </w:pPr>
-            <w:r>
-              <w:rPr>
-                <w:color w:val="0F172A"/>
-                <w:sz w:val="17"/>
-              </w:rPr>
-              <w:t>42 mins</w:t>
-            </w:r>
-          </w:p>
-        </w:tc>
-        <w:tc>
-          <w:tcPr>
-            <w:tcW w:type="dxa" w:w="1987"/>
-            <w:shd w:fill="FFFFFF"/>
-            <w:tcMar>
-              <w:top w:w="60" w:type="dxa"/>
-              <w:bottom w:w="60" w:type="dxa"/>
-              <w:left w:w="80" w:type="dxa"/>
-              <w:right w:w="80" w:type="dxa"/>
-            </w:tcMar>
-          </w:tcPr>
-          <w:p>
-            <w:pPr>
-              <w:jc w:val="center"/>
-            </w:pPr>
-            <w:r>
-              <w:rPr>
-                <w:color w:val="0F172A"/>
-                <w:sz w:val="17"/>
-              </w:rPr>
-              <w:t>✅ Budget Saver</w:t>
-            </w:r>
-          </w:p>
-        </w:tc>
-        <w:tc>
-          <w:tcPr>
-            <w:tcW w:type="dxa" w:w="1987"/>
-            <w:shd w:fill="FFFFFF"/>
-            <w:tcMar>
-              <w:top w:w="60" w:type="dxa"/>
-              <w:bottom w:w="60" w:type="dxa"/>
-              <w:left w:w="80" w:type="dxa"/>
-              <w:right w:w="80" w:type="dxa"/>
-            </w:tcMar>
-          </w:tcPr>
-          <w:p>
-            <w:r>
-              <w:rPr>
-                <w:color w:val="0F172A"/>
-                <w:sz w:val="17"/>
-              </w:rPr>
-              <w:t>Daily pocket-friendly</w:t>
-            </w:r>
-          </w:p>
-        </w:tc>
-      </w:tr>
-      <w:tr>
-        <w:tc>
-          <w:tcPr>
-            <w:tcW w:type="dxa" w:w="1987"/>
-            <w:shd w:fill="F8FAFC"/>
-            <w:tcMar>
-              <w:top w:w="60" w:type="dxa"/>
-              <w:bottom w:w="60" w:type="dxa"/>
-              <w:left w:w="80" w:type="dxa"/>
-              <w:right w:w="80" w:type="dxa"/>
-            </w:tcMar>
-          </w:tcPr>
-          <w:p>
-            <w:r>
-              <w:rPr>
-                <w:color w:val="0F172A"/>
-                <w:sz w:val="17"/>
-              </w:rPr>
-              <w:t>Bike Taxi (Rapido/Ola)</w:t>
-            </w:r>
-          </w:p>
-        </w:tc>
-        <w:tc>
-          <w:tcPr>
-            <w:tcW w:type="dxa" w:w="1987"/>
-            <w:shd w:fill="F8FAFC"/>
-            <w:tcMar>
-              <w:top w:w="60" w:type="dxa"/>
-              <w:bottom w:w="60" w:type="dxa"/>
-              <w:left w:w="80" w:type="dxa"/>
-              <w:right w:w="80" w:type="dxa"/>
-            </w:tcMar>
-          </w:tcPr>
-          <w:p>
-            <w:pPr>
-              <w:jc w:val="center"/>
-            </w:pPr>
-            <w:r>
-              <w:rPr>
-                <w:color w:val="0F172A"/>
-                <w:sz w:val="17"/>
-              </w:rPr>
-              <w:t>₹120</w:t>
-            </w:r>
-          </w:p>
-        </w:tc>
-        <w:tc>
-          <w:tcPr>
-            <w:tcW w:type="dxa" w:w="1987"/>
-            <w:shd w:fill="F8FAFC"/>
-            <w:tcMar>
-              <w:top w:w="60" w:type="dxa"/>
-              <w:bottom w:w="60" w:type="dxa"/>
-              <w:left w:w="80" w:type="dxa"/>
-              <w:right w:w="80" w:type="dxa"/>
-            </w:tcMar>
-          </w:tcPr>
-          <w:p>
-            <w:pPr>
-              <w:jc w:val="center"/>
-            </w:pPr>
-            <w:r>
-              <w:rPr>
-                <w:color w:val="0F172A"/>
-                <w:sz w:val="17"/>
-              </w:rPr>
-              <w:t>32 mins</w:t>
-            </w:r>
-          </w:p>
-        </w:tc>
-        <w:tc>
-          <w:tcPr>
-            <w:tcW w:type="dxa" w:w="1987"/>
-            <w:shd w:fill="F8FAFC"/>
-            <w:tcMar>
-              <w:top w:w="60" w:type="dxa"/>
-              <w:bottom w:w="60" w:type="dxa"/>
-              <w:left w:w="80" w:type="dxa"/>
-              <w:right w:w="80" w:type="dxa"/>
-            </w:tcMar>
-          </w:tcPr>
-          <w:p>
-            <w:pPr>
-              <w:jc w:val="center"/>
-            </w:pPr>
-            <w:r>
-              <w:rPr>
-                <w:color w:val="0F172A"/>
-                <w:sz w:val="17"/>
-              </w:rPr>
-              <w:t>⚠️ Moderate Surge</w:t>
-            </w:r>
-          </w:p>
-        </w:tc>
-        <w:tc>
-          <w:tcPr>
-            <w:tcW w:type="dxa" w:w="1987"/>
-            <w:shd w:fill="F8FAFC"/>
-            <w:tcMar>
-              <w:top w:w="60" w:type="dxa"/>
-              <w:bottom w:w="60" w:type="dxa"/>
-              <w:left w:w="80" w:type="dxa"/>
-              <w:right w:w="80" w:type="dxa"/>
-            </w:tcMar>
-          </w:tcPr>
-          <w:p>
-            <w:r>
-              <w:rPr>
-                <w:color w:val="0F172A"/>
-                <w:sz w:val="17"/>
-              </w:rPr>
-              <w:t>Solo last-mile trip</w:t>
-            </w:r>
-          </w:p>
-        </w:tc>
-      </w:tr>
-      <w:tr>
-        <w:tc>
-          <w:tcPr>
-            <w:tcW w:type="dxa" w:w="1987"/>
-            <w:shd w:fill="FFFFFF"/>
-            <w:tcMar>
-              <w:top w:w="60" w:type="dxa"/>
-              <w:bottom w:w="60" w:type="dxa"/>
-              <w:left w:w="80" w:type="dxa"/>
-              <w:right w:w="80" w:type="dxa"/>
-            </w:tcMar>
-          </w:tcPr>
-          <w:p>
-            <w:r>
-              <w:rPr>
-                <w:color w:val="0F172A"/>
-                <w:sz w:val="17"/>
-              </w:rPr>
-              <w:t>Auto Rickshaw</w:t>
-            </w:r>
-          </w:p>
-        </w:tc>
-        <w:tc>
-          <w:tcPr>
-            <w:tcW w:type="dxa" w:w="1987"/>
-            <w:shd w:fill="FFFFFF"/>
-            <w:tcMar>
-              <w:top w:w="60" w:type="dxa"/>
-              <w:bottom w:w="60" w:type="dxa"/>
-              <w:left w:w="80" w:type="dxa"/>
-              <w:right w:w="80" w:type="dxa"/>
-            </w:tcMar>
-          </w:tcPr>
-          <w:p>
-            <w:pPr>
-              <w:jc w:val="center"/>
-            </w:pPr>
-            <w:r>
-              <w:rPr>
-                <w:color w:val="0F172A"/>
-                <w:sz w:val="17"/>
-              </w:rPr>
-              <w:t>₹185</w:t>
-            </w:r>
-          </w:p>
-        </w:tc>
-        <w:tc>
-          <w:tcPr>
-            <w:tcW w:type="dxa" w:w="1987"/>
-            <w:shd w:fill="FFFFFF"/>
-            <w:tcMar>
-              <w:top w:w="60" w:type="dxa"/>
-              <w:bottom w:w="60" w:type="dxa"/>
-              <w:left w:w="80" w:type="dxa"/>
-              <w:right w:w="80" w:type="dxa"/>
-            </w:tcMar>
-          </w:tcPr>
-          <w:p>
-            <w:pPr>
-              <w:jc w:val="center"/>
-            </w:pPr>
-            <w:r>
-              <w:rPr>
-                <w:color w:val="0F172A"/>
-                <w:sz w:val="17"/>
-              </w:rPr>
-              <w:t>55 mins</w:t>
-            </w:r>
-          </w:p>
-        </w:tc>
-        <w:tc>
-          <w:tcPr>
-            <w:tcW w:type="dxa" w:w="1987"/>
-            <w:shd w:fill="FFFFFF"/>
-            <w:tcMar>
-              <w:top w:w="60" w:type="dxa"/>
-              <w:bottom w:w="60" w:type="dxa"/>
-              <w:left w:w="80" w:type="dxa"/>
-              <w:right w:w="80" w:type="dxa"/>
-            </w:tcMar>
-          </w:tcPr>
-          <w:p>
-            <w:pPr>
-              <w:jc w:val="center"/>
-            </w:pPr>
-            <w:r>
-              <w:rPr>
-                <w:color w:val="0F172A"/>
-                <w:sz w:val="17"/>
-              </w:rPr>
-              <w:t>⚠️ Meter + Rain Surge</w:t>
-            </w:r>
-          </w:p>
-        </w:tc>
-        <w:tc>
-          <w:tcPr>
-            <w:tcW w:type="dxa" w:w="1987"/>
-            <w:shd w:fill="FFFFFF"/>
-            <w:tcMar>
-              <w:top w:w="60" w:type="dxa"/>
-              <w:bottom w:w="60" w:type="dxa"/>
-              <w:left w:w="80" w:type="dxa"/>
-              <w:right w:w="80" w:type="dxa"/>
-            </w:tcMar>
-          </w:tcPr>
-          <w:p>
-            <w:r>
-              <w:rPr>
-                <w:color w:val="0F172A"/>
-                <w:sz w:val="17"/>
-              </w:rPr>
-              <w:t>Doorstep point-to-point</w:t>
-            </w:r>
-          </w:p>
-        </w:tc>
-      </w:tr>
-      <w:tr>
-        <w:tc>
-          <w:tcPr>
-            <w:tcW w:type="dxa" w:w="1987"/>
-            <w:shd w:fill="F8FAFC"/>
-            <w:tcMar>
-              <w:top w:w="60" w:type="dxa"/>
-              <w:bottom w:w="60" w:type="dxa"/>
-              <w:left w:w="80" w:type="dxa"/>
-              <w:right w:w="80" w:type="dxa"/>
-            </w:tcMar>
-          </w:tcPr>
-          <w:p>
-            <w:r>
-              <w:rPr>
-                <w:color w:val="0F172A"/>
-                <w:sz w:val="17"/>
-              </w:rPr>
-              <w:t>Cab / Sedan (Surge)</w:t>
-            </w:r>
-          </w:p>
-        </w:tc>
-        <w:tc>
-          <w:tcPr>
-            <w:tcW w:type="dxa" w:w="1987"/>
-            <w:shd w:fill="F8FAFC"/>
-            <w:tcMar>
-              <w:top w:w="60" w:type="dxa"/>
-              <w:bottom w:w="60" w:type="dxa"/>
-              <w:left w:w="80" w:type="dxa"/>
-              <w:right w:w="80" w:type="dxa"/>
-            </w:tcMar>
-          </w:tcPr>
-          <w:p>
-            <w:pPr>
-              <w:jc w:val="center"/>
-            </w:pPr>
-            <w:r>
-              <w:rPr>
-                <w:color w:val="0F172A"/>
-                <w:sz w:val="17"/>
-              </w:rPr>
-              <w:t>₹480</w:t>
-            </w:r>
-          </w:p>
-        </w:tc>
-        <w:tc>
-          <w:tcPr>
-            <w:tcW w:type="dxa" w:w="1987"/>
-            <w:shd w:fill="F8FAFC"/>
-            <w:tcMar>
-              <w:top w:w="60" w:type="dxa"/>
-              <w:bottom w:w="60" w:type="dxa"/>
-              <w:left w:w="80" w:type="dxa"/>
-              <w:right w:w="80" w:type="dxa"/>
-            </w:tcMar>
-          </w:tcPr>
-          <w:p>
-            <w:pPr>
-              <w:jc w:val="center"/>
-            </w:pPr>
-            <w:r>
-              <w:rPr>
-                <w:color w:val="0F172A"/>
-                <w:sz w:val="17"/>
-              </w:rPr>
-              <w:t>68 mins</w:t>
-            </w:r>
-          </w:p>
-        </w:tc>
-        <w:tc>
-          <w:tcPr>
-            <w:tcW w:type="dxa" w:w="1987"/>
-            <w:shd w:fill="F8FAFC"/>
-            <w:tcMar>
-              <w:top w:w="60" w:type="dxa"/>
-              <w:bottom w:w="60" w:type="dxa"/>
-              <w:left w:w="80" w:type="dxa"/>
-              <w:right w:w="80" w:type="dxa"/>
-            </w:tcMar>
-          </w:tcPr>
-          <w:p>
-            <w:pPr>
-              <w:jc w:val="center"/>
-            </w:pPr>
-            <w:r>
-              <w:rPr>
-                <w:color w:val="0F172A"/>
-                <w:sz w:val="17"/>
-              </w:rPr>
-              <w:t>❌ Heavy 2.2x Surge</w:t>
-            </w:r>
-          </w:p>
-        </w:tc>
-        <w:tc>
-          <w:tcPr>
-            <w:tcW w:type="dxa" w:w="1987"/>
-            <w:shd w:fill="F8FAFC"/>
-            <w:tcMar>
-              <w:top w:w="60" w:type="dxa"/>
-              <w:bottom w:w="60" w:type="dxa"/>
-              <w:left w:w="80" w:type="dxa"/>
-              <w:right w:w="80" w:type="dxa"/>
-            </w:tcMar>
-          </w:tcPr>
-          <w:p>
-            <w:r>
-              <w:rPr>
-                <w:color w:val="0F172A"/>
-                <w:sz w:val="17"/>
-              </w:rPr>
-              <w:t>Rain / Heavy luggage only</w:t>
+              <w:t>During 6:00 PM peak rains, cab surge escalates to ₹480+ with travel times stretching to 68 minutes in gridlock. Namma Metro Purple Line bypasses road traffic in 28 minutes for ₹35, while BMTC Vajra AC buses provide comfortable transit along the Outer Ring Road for ₹60, delivering over 85% cost savings.</w:t>
             </w:r>
           </w:p>
         </w:tc>
@@ -1749,7 +1003,7 @@
     </w:tbl>
     <w:p>
       <w:pPr>
-        <w:spacing w:after="160"/>
+        <w:spacing w:after="120"/>
       </w:pPr>
     </w:p>
     <w:p>
@@ -1763,12 +1017,12 @@
           <w:color w:val="0F172A"/>
           <w:sz w:val="32"/>
         </w:rPr>
-        <w:t>4. AI Bottleneck Radar &amp; Departure Optimization</w:t>
+        <w:t>4. 24-Hour City Thermal Pulse &amp; Golden Departure Window</w:t>
       </w:r>
     </w:p>
     <w:p>
       <w:r>
-        <w:t>Using historical bottleneck data and live telemetry across 6 key Bengaluru chokepoints (Silk Board, Tin Factory, Hebbal Flyover, Sony World Koramangala, Ecospace Bellandur, and Goraguntepalya), the AI agent models dynamic traffic delay curves.</w:t>
+        <w:t>By analyzing congestion curves across Silk Board, Tin Factory, Hebbal Flyover, and Bellandur Ecospace, the AI agent identifies optimal departure curves to avoid peak bottleneck hours:</w:t>
       </w:r>
     </w:p>
     <w:p>
@@ -1780,7 +1034,7 @@
       <w:r>
         <w:drawing>
           <wp:inline xmlns:a="http://schemas.openxmlformats.org/drawingml/2006/main" xmlns:pic="http://schemas.openxmlformats.org/drawingml/2006/picture">
-            <wp:extent cx="5852160" cy="2740885"/>
+            <wp:extent cx="5943600" cy="2664373"/>
             <wp:docPr id="3" name="Picture 3"/>
             <wp:cNvGraphicFramePr>
               <a:graphicFrameLocks noChangeAspect="1"/>
@@ -1789,7 +1043,7 @@
               <a:graphicData uri="http://schemas.openxmlformats.org/drawingml/2006/picture">
                 <pic:pic>
                   <pic:nvPicPr>
-                    <pic:cNvPr id="0" name="hourly_congestion_curve.png"/>
+                    <pic:cNvPr id="0" name="hourly_congestion_cinematic.png"/>
                     <pic:cNvPicPr/>
                   </pic:nvPicPr>
                   <pic:blipFill>
@@ -1801,7 +1055,7 @@
                   <pic:spPr>
                     <a:xfrm>
                       <a:off x="0" y="0"/>
-                      <a:ext cx="5852160" cy="2740885"/>
+                      <a:ext cx="5943600" cy="2664373"/>
                     </a:xfrm>
                     <a:prstGeom prst="rect"/>
                   </pic:spPr>
@@ -1823,67 +1077,8 @@
           <w:color w:val="64748B"/>
           <w:sz w:val="17"/>
         </w:rPr>
-        <w:t>Figure 3: AI Predicted Delay Curves and Recommended Off-Peak Departure Windows</w:t>
+        <w:t>Figure 3: 24-Hour Bengaluru Traffic Thermal Pulse and AI Predicted Golden Departure Windows</w:t>
       </w:r>
-    </w:p>
-    <w:tbl>
-      <w:tblPr>
-        <w:tblW w:type="auto" w:w="0"/>
-        <w:jc w:val="center"/>
-        <w:tblLayout w:type="fixed"/>
-        <w:tblLook w:firstColumn="1" w:firstRow="1" w:lastColumn="0" w:lastRow="0" w:noHBand="0" w:noVBand="1" w:val="04A0"/>
-      </w:tblPr>
-      <w:tblGrid>
-        <w:gridCol w:w="9360"/>
-      </w:tblGrid>
-      <w:tr>
-        <w:tc>
-          <w:tcPr>
-            <w:tcW w:type="dxa" w:w="9936"/>
-            <w:shd w:fill="F0FDF4"/>
-            <w:tcMar>
-              <w:top w:w="140" w:type="dxa"/>
-              <w:bottom w:w="140" w:type="dxa"/>
-              <w:left w:w="180" w:type="dxa"/>
-              <w:right w:w="180" w:type="dxa"/>
-            </w:tcMar>
-            <w:tcBorders>
-              <w:top w:val="none"/>
-              <w:left w:val="single" w:sz="24" w:space="0" w:color="16A34A"/>
-              <w:bottom w:val="none"/>
-              <w:right w:val="none"/>
-            </w:tcBorders>
-          </w:tcPr>
-          <w:p>
-            <w:pPr>
-              <w:spacing w:before="40" w:after="60"/>
-            </w:pPr>
-            <w:r>
-              <w:rPr>
-                <w:rFonts w:ascii="Calibri" w:hAnsi="Calibri"/>
-                <w:b/>
-                <w:color w:val="16A34A"/>
-                <w:sz w:val="21"/>
-              </w:rPr>
-              <w:t>📌 AI Agent Recommendation Advice</w:t>
-              <w:br/>
-            </w:r>
-            <w:r>
-              <w:rPr>
-                <w:rFonts w:ascii="Calibri" w:hAnsi="Calibri"/>
-                <w:color w:val="334155"/>
-                <w:sz w:val="19"/>
-              </w:rPr>
-              <w:t>Leaving at 4:30 PM instead of 6:00 PM saves 47 minutes in traffic gridlock on the Marathahalli-Whitefield stretch. Switching to Metro at Majestic bypasses surface congestion completely.</w:t>
-            </w:r>
-          </w:p>
-        </w:tc>
-      </w:tr>
-    </w:tbl>
-    <w:p>
-      <w:pPr>
-        <w:spacing w:after="120"/>
-      </w:pPr>
     </w:p>
     <w:p>
       <w:r>
@@ -1901,12 +1096,12 @@
           <w:color w:val="0F172A"/>
           <w:sz w:val="32"/>
         </w:rPr>
-        <w:t>5. Secure Authentication: Gmail &amp; Mobile OTP</w:t>
+        <w:t>5. Biometric Shield: Google SSO &amp; Mobile +91 OTP</w:t>
       </w:r>
     </w:p>
     <w:p>
       <w:r>
-        <w:t>Namma Travel App delivers an effortless, frictionless mobile sign-in experience tailored to Indian transit users. Users can authenticate via Google Single Sign-On (Gmail) or an Indian 10-digit mobile number with SMS OTP.</w:t>
+        <w:t>Designed specifically for Indian commuters, Namma Travel offers dual-channel authentication. Commuters can sign in with 1-tap Google / Gmail OAuth or verify via 10-digit mobile number with 6-digit OTP:</w:t>
       </w:r>
     </w:p>
     <w:p>
@@ -1918,7 +1113,7 @@
       <w:r>
         <w:drawing>
           <wp:inline xmlns:a="http://schemas.openxmlformats.org/drawingml/2006/main" xmlns:pic="http://schemas.openxmlformats.org/drawingml/2006/picture">
-            <wp:extent cx="5852160" cy="2296417"/>
+            <wp:extent cx="5943600" cy="2391104"/>
             <wp:docPr id="4" name="Picture 4"/>
             <wp:cNvGraphicFramePr>
               <a:graphicFrameLocks noChangeAspect="1"/>
@@ -1927,7 +1122,7 @@
               <a:graphicData uri="http://schemas.openxmlformats.org/drawingml/2006/picture">
                 <pic:pic>
                   <pic:nvPicPr>
-                    <pic:cNvPr id="0" name="auth_architecture_diagram.png"/>
+                    <pic:cNvPr id="0" name="auth_pipeline_cinematic.png"/>
                     <pic:cNvPicPr/>
                   </pic:nvPicPr>
                   <pic:blipFill>
@@ -1939,7 +1134,7 @@
                   <pic:spPr>
                     <a:xfrm>
                       <a:off x="0" y="0"/>
-                      <a:ext cx="5852160" cy="2296417"/>
+                      <a:ext cx="5943600" cy="2391104"/>
                     </a:xfrm>
                     <a:prstGeom prst="rect"/>
                   </pic:spPr>
@@ -1961,7 +1156,7 @@
           <w:color w:val="64748B"/>
           <w:sz w:val="17"/>
         </w:rPr>
-        <w:t>Figure 4: Dual Authentication Pipeline &amp; User Personalization State Machine</w:t>
+        <w:t>Figure 4: Biometric &amp; Multi-Factor Commuter Identity Pipeline with Wallet Synchronization</w:t>
       </w:r>
     </w:p>
     <w:tbl>
@@ -1972,308 +1167,47 @@
         <w:tblLook w:firstColumn="1" w:firstRow="1" w:lastColumn="0" w:lastRow="0" w:noHBand="0" w:noVBand="1" w:val="04A0"/>
       </w:tblPr>
       <w:tblGrid>
-        <w:gridCol w:w="2592"/>
-        <w:gridCol w:w="3456"/>
-        <w:gridCol w:w="3312"/>
+        <w:gridCol w:w="9360"/>
       </w:tblGrid>
       <w:tr>
         <w:tc>
           <w:tcPr>
-            <w:tcW w:type="dxa" w:w="3312"/>
-            <w:shd w:fill="1A73E8"/>
+            <w:tcW w:type="dxa" w:w="9936"/>
+            <w:shd w:fill="0F172A"/>
             <w:tcMar>
-              <w:top w:w="80" w:type="dxa"/>
-              <w:bottom w:w="80" w:type="dxa"/>
-              <w:left w:w="100" w:type="dxa"/>
-              <w:right w:w="100" w:type="dxa"/>
+              <w:top w:w="140" w:type="dxa"/>
+              <w:bottom w:w="140" w:type="dxa"/>
+              <w:left w:w="180" w:type="dxa"/>
+              <w:right w:w="180" w:type="dxa"/>
             </w:tcMar>
+            <w:tcBorders>
+              <w:top w:val="none"/>
+              <w:left w:val="single" w:sz="28" w:space="0" w:color="C084FC"/>
+              <w:bottom w:val="none"/>
+              <w:right w:val="none"/>
+            </w:tcBorders>
           </w:tcPr>
           <w:p>
             <w:pPr>
-              <w:jc w:val="center"/>
+              <w:spacing w:before="40" w:after="60"/>
             </w:pPr>
             <w:r>
               <w:rPr>
+                <w:rFonts w:ascii="Calibri" w:hAnsi="Calibri"/>
                 <w:b/>
-                <w:color w:val="FFFFFF"/>
-                <w:sz w:val="17"/>
+                <w:color w:val="C084FC"/>
+                <w:sz w:val="22"/>
               </w:rPr>
-              <w:t>CAPABILITY</w:t>
+              <w:t>⚡ Commuter Vault Synchronization</w:t>
+              <w:br/>
             </w:r>
-          </w:p>
-        </w:tc>
-        <w:tc>
-          <w:tcPr>
-            <w:tcW w:type="dxa" w:w="3312"/>
-            <w:shd w:fill="1A73E8"/>
-            <w:tcMar>
-              <w:top w:w="80" w:type="dxa"/>
-              <w:bottom w:w="80" w:type="dxa"/>
-              <w:left w:w="100" w:type="dxa"/>
-              <w:right w:w="100" w:type="dxa"/>
-            </w:tcMar>
-          </w:tcPr>
-          <w:p>
-            <w:pPr>
-              <w:jc w:val="center"/>
-            </w:pPr>
             <w:r>
               <w:rPr>
-                <w:b/>
-                <w:color w:val="FFFFFF"/>
-                <w:sz w:val="17"/>
+                <w:rFonts w:ascii="Calibri" w:hAnsi="Calibri"/>
+                <w:color w:val="E2E8F0"/>
+                <w:sz w:val="19"/>
               </w:rPr>
-              <w:t>GOOGLE / GMAIL SIGN-IN</w:t>
-            </w:r>
-          </w:p>
-        </w:tc>
-        <w:tc>
-          <w:tcPr>
-            <w:tcW w:type="dxa" w:w="3312"/>
-            <w:shd w:fill="1A73E8"/>
-            <w:tcMar>
-              <w:top w:w="80" w:type="dxa"/>
-              <w:bottom w:w="80" w:type="dxa"/>
-              <w:left w:w="100" w:type="dxa"/>
-              <w:right w:w="100" w:type="dxa"/>
-            </w:tcMar>
-          </w:tcPr>
-          <w:p>
-            <w:pPr>
-              <w:jc w:val="center"/>
-            </w:pPr>
-            <w:r>
-              <w:rPr>
-                <w:b/>
-                <w:color w:val="FFFFFF"/>
-                <w:sz w:val="17"/>
-              </w:rPr>
-              <w:t>MOBILE NUMBER WITH OTP</w:t>
-            </w:r>
-          </w:p>
-        </w:tc>
-      </w:tr>
-      <w:tr>
-        <w:tc>
-          <w:tcPr>
-            <w:tcW w:type="dxa" w:w="3312"/>
-            <w:shd w:fill="FFFFFF"/>
-            <w:tcMar>
-              <w:top w:w="60" w:type="dxa"/>
-              <w:bottom w:w="60" w:type="dxa"/>
-              <w:left w:w="80" w:type="dxa"/>
-              <w:right w:w="80" w:type="dxa"/>
-            </w:tcMar>
-          </w:tcPr>
-          <w:p>
-            <w:pPr>
-              <w:jc w:val="left"/>
-            </w:pPr>
-            <w:r>
-              <w:rPr>
-                <w:b/>
-                <w:color w:val="0F172A"/>
-                <w:sz w:val="17"/>
-              </w:rPr>
-              <w:t>Authentication Speed</w:t>
-            </w:r>
-          </w:p>
-        </w:tc>
-        <w:tc>
-          <w:tcPr>
-            <w:tcW w:type="dxa" w:w="3312"/>
-            <w:shd w:fill="FFFFFF"/>
-            <w:tcMar>
-              <w:top w:w="60" w:type="dxa"/>
-              <w:bottom w:w="60" w:type="dxa"/>
-              <w:left w:w="80" w:type="dxa"/>
-              <w:right w:w="80" w:type="dxa"/>
-            </w:tcMar>
-          </w:tcPr>
-          <w:p>
-            <w:pPr>
-              <w:jc w:val="left"/>
-            </w:pPr>
-            <w:r>
-              <w:rPr>
-                <w:color w:val="0F172A"/>
-                <w:sz w:val="17"/>
-              </w:rPr>
-              <w:t>1-Tap instant OAuth popup</w:t>
-            </w:r>
-          </w:p>
-        </w:tc>
-        <w:tc>
-          <w:tcPr>
-            <w:tcW w:type="dxa" w:w="3312"/>
-            <w:shd w:fill="FFFFFF"/>
-            <w:tcMar>
-              <w:top w:w="60" w:type="dxa"/>
-              <w:bottom w:w="60" w:type="dxa"/>
-              <w:left w:w="80" w:type="dxa"/>
-              <w:right w:w="80" w:type="dxa"/>
-            </w:tcMar>
-          </w:tcPr>
-          <w:p>
-            <w:pPr>
-              <w:jc w:val="left"/>
-            </w:pPr>
-            <w:r>
-              <w:rPr>
-                <w:color w:val="0F172A"/>
-                <w:sz w:val="17"/>
-              </w:rPr>
-              <w:t>30-sec OTP SMS verification</w:t>
-            </w:r>
-          </w:p>
-        </w:tc>
-      </w:tr>
-      <w:tr>
-        <w:tc>
-          <w:tcPr>
-            <w:tcW w:type="dxa" w:w="3312"/>
-            <w:shd w:fill="F8FAFC"/>
-            <w:tcMar>
-              <w:top w:w="60" w:type="dxa"/>
-              <w:bottom w:w="60" w:type="dxa"/>
-              <w:left w:w="80" w:type="dxa"/>
-              <w:right w:w="80" w:type="dxa"/>
-            </w:tcMar>
-          </w:tcPr>
-          <w:p>
-            <w:pPr>
-              <w:jc w:val="left"/>
-            </w:pPr>
-            <w:r>
-              <w:rPr>
-                <w:b/>
-                <w:color w:val="0F172A"/>
-                <w:sz w:val="17"/>
-              </w:rPr>
-              <w:t>User Credentials</w:t>
-            </w:r>
-          </w:p>
-        </w:tc>
-        <w:tc>
-          <w:tcPr>
-            <w:tcW w:type="dxa" w:w="3312"/>
-            <w:shd w:fill="F8FAFC"/>
-            <w:tcMar>
-              <w:top w:w="60" w:type="dxa"/>
-              <w:bottom w:w="60" w:type="dxa"/>
-              <w:left w:w="80" w:type="dxa"/>
-              <w:right w:w="80" w:type="dxa"/>
-            </w:tcMar>
-          </w:tcPr>
-          <w:p>
-            <w:pPr>
-              <w:jc w:val="left"/>
-            </w:pPr>
-            <w:r>
-              <w:rPr>
-                <w:color w:val="0F172A"/>
-                <w:sz w:val="17"/>
-              </w:rPr>
-              <w:t>Google Email &amp; profile avatar</w:t>
-            </w:r>
-          </w:p>
-        </w:tc>
-        <w:tc>
-          <w:tcPr>
-            <w:tcW w:type="dxa" w:w="3312"/>
-            <w:shd w:fill="F8FAFC"/>
-            <w:tcMar>
-              <w:top w:w="60" w:type="dxa"/>
-              <w:bottom w:w="60" w:type="dxa"/>
-              <w:left w:w="80" w:type="dxa"/>
-              <w:right w:w="80" w:type="dxa"/>
-            </w:tcMar>
-          </w:tcPr>
-          <w:p>
-            <w:pPr>
-              <w:jc w:val="left"/>
-            </w:pPr>
-            <w:r>
-              <w:rPr>
-                <w:color w:val="0F172A"/>
-                <w:sz w:val="17"/>
-              </w:rPr>
-              <w:t>+91 10-digit Indian mobile number</w:t>
-            </w:r>
-          </w:p>
-        </w:tc>
-      </w:tr>
-      <w:tr>
-        <w:tc>
-          <w:tcPr>
-            <w:tcW w:type="dxa" w:w="3312"/>
-            <w:shd w:fill="FFFFFF"/>
-            <w:tcMar>
-              <w:top w:w="60" w:type="dxa"/>
-              <w:bottom w:w="60" w:type="dxa"/>
-              <w:left w:w="80" w:type="dxa"/>
-              <w:right w:w="80" w:type="dxa"/>
-            </w:tcMar>
-          </w:tcPr>
-          <w:p>
-            <w:pPr>
-              <w:jc w:val="left"/>
-            </w:pPr>
-            <w:r>
-              <w:rPr>
-                <w:b/>
-                <w:color w:val="0F172A"/>
-                <w:sz w:val="17"/>
-              </w:rPr>
-              <w:t>Commuter Features</w:t>
-            </w:r>
-          </w:p>
-        </w:tc>
-        <w:tc>
-          <w:tcPr>
-            <w:tcW w:type="dxa" w:w="3312"/>
-            <w:shd w:fill="FFFFFF"/>
-            <w:tcMar>
-              <w:top w:w="60" w:type="dxa"/>
-              <w:bottom w:w="60" w:type="dxa"/>
-              <w:left w:w="80" w:type="dxa"/>
-              <w:right w:w="80" w:type="dxa"/>
-            </w:tcMar>
-          </w:tcPr>
-          <w:p>
-            <w:pPr>
-              <w:jc w:val="left"/>
-            </w:pPr>
-            <w:r>
-              <w:rPr>
-                <w:color w:val="0F172A"/>
-                <w:sz w:val="17"/>
-              </w:rPr>
-              <w:t>Smart Card sync (₹280), BMTC Pass</w:t>
-            </w:r>
-          </w:p>
-        </w:tc>
-        <w:tc>
-          <w:tcPr>
-            <w:tcW w:type="dxa" w:w="3312"/>
-            <w:shd w:fill="FFFFFF"/>
-            <w:tcMar>
-              <w:top w:w="60" w:type="dxa"/>
-              <w:bottom w:w="60" w:type="dxa"/>
-              <w:left w:w="80" w:type="dxa"/>
-              <w:right w:w="80" w:type="dxa"/>
-            </w:tcMar>
-          </w:tcPr>
-          <w:p>
-            <w:pPr>
-              <w:jc w:val="left"/>
-            </w:pPr>
-            <w:r>
-              <w:rPr>
-                <w:color w:val="0F172A"/>
-                <w:sz w:val="17"/>
-              </w:rPr>
-              <w:t>Daily pass status, Favorite routes alert</w:t>
+              <w:t>Upon authentication, the mobile app automatically links the commuter's Namma Metro Smart Card balance (₹280.00), BMTC Digital Daily Pass status (Active Zone 1-3), and saved corridors (Koramangala ⇄ Whitefield) with offline session encryption.</w:t>
             </w:r>
           </w:p>
         </w:tc>
@@ -2281,7 +1215,7 @@
     </w:tbl>
     <w:p>
       <w:pPr>
-        <w:spacing w:after="160"/>
+        <w:spacing w:after="120"/>
       </w:pPr>
     </w:p>
     <w:p>
@@ -2295,12 +1229,12 @@
           <w:color w:val="0F172A"/>
           <w:sz w:val="32"/>
         </w:rPr>
-        <w:t>6. Play Store &amp; App Store Distribution Architecture</w:t>
+        <w:t>6. Mission Launch: Play Store &amp; App Store Distribution</w:t>
       </w:r>
     </w:p>
     <w:p>
       <w:r>
-        <w:t>The app is structured under the dedicated `namma-travel-app/` repository directory, utilizing standard cross-platform packaging tools to deliver native binaries for both Google Play Store and Apple App Store:</w:t>
+        <w:t>Packaged under the dedicated `namma-travel-app/` directory, the single-codebase architecture delivers native binaries for Google Play Store and Apple App Store alongside instant zero-download progressive web apps:</w:t>
       </w:r>
     </w:p>
     <w:p>
@@ -2312,7 +1246,7 @@
       <w:r>
         <w:drawing>
           <wp:inline xmlns:a="http://schemas.openxmlformats.org/drawingml/2006/main" xmlns:pic="http://schemas.openxmlformats.org/drawingml/2006/picture">
-            <wp:extent cx="5852160" cy="2296417"/>
+            <wp:extent cx="5943600" cy="2391104"/>
             <wp:docPr id="5" name="Picture 5"/>
             <wp:cNvGraphicFramePr>
               <a:graphicFrameLocks noChangeAspect="1"/>
@@ -2321,7 +1255,7 @@
               <a:graphicData uri="http://schemas.openxmlformats.org/drawingml/2006/picture">
                 <pic:pic>
                   <pic:nvPicPr>
-                    <pic:cNvPr id="0" name="distribution_pipeline.png"/>
+                    <pic:cNvPr id="0" name="distribution_cinematic.png"/>
                     <pic:cNvPicPr/>
                   </pic:nvPicPr>
                   <pic:blipFill>
@@ -2333,7 +1267,7 @@
                   <pic:spPr>
                     <a:xfrm>
                       <a:off x="0" y="0"/>
-                      <a:ext cx="5852160" cy="2296417"/>
+                      <a:ext cx="5943600" cy="2391104"/>
                     </a:xfrm>
                     <a:prstGeom prst="rect"/>
                   </pic:spPr>
@@ -2355,71 +1289,8 @@
           <w:color w:val="64748B"/>
           <w:sz w:val="17"/>
         </w:rPr>
-        <w:t>Figure 5: Google Play Store &amp; Apple App Store Packaging and Release Architecture</w:t>
+        <w:t>Figure 5: Cross-Platform Build, Native Packaging, and Multi-Store Release Orbit</w:t>
       </w:r>
-    </w:p>
-    <w:tbl>
-      <w:tblPr>
-        <w:tblW w:type="auto" w:w="0"/>
-        <w:jc w:val="center"/>
-        <w:tblLayout w:type="fixed"/>
-        <w:tblLook w:firstColumn="1" w:firstRow="1" w:lastColumn="0" w:lastRow="0" w:noHBand="0" w:noVBand="1" w:val="04A0"/>
-      </w:tblPr>
-      <w:tblGrid>
-        <w:gridCol w:w="9360"/>
-      </w:tblGrid>
-      <w:tr>
-        <w:tc>
-          <w:tcPr>
-            <w:tcW w:type="dxa" w:w="9936"/>
-            <w:shd w:fill="FAF5FF"/>
-            <w:tcMar>
-              <w:top w:w="140" w:type="dxa"/>
-              <w:bottom w:w="140" w:type="dxa"/>
-              <w:left w:w="180" w:type="dxa"/>
-              <w:right w:w="180" w:type="dxa"/>
-            </w:tcMar>
-            <w:tcBorders>
-              <w:top w:val="none"/>
-              <w:left w:val="single" w:sz="24" w:space="0" w:color="9333EA"/>
-              <w:bottom w:val="none"/>
-              <w:right w:val="none"/>
-            </w:tcBorders>
-          </w:tcPr>
-          <w:p>
-            <w:pPr>
-              <w:spacing w:before="40" w:after="60"/>
-            </w:pPr>
-            <w:r>
-              <w:rPr>
-                <w:rFonts w:ascii="Calibri" w:hAnsi="Calibri"/>
-                <w:b/>
-                <w:color w:val="9333EA"/>
-                <w:sz w:val="21"/>
-              </w:rPr>
-              <w:t>📌 Production Packaging Artifacts Ready in Repository</w:t>
-              <w:br/>
-            </w:r>
-            <w:r>
-              <w:rPr>
-                <w:rFonts w:ascii="Calibri" w:hAnsi="Calibri"/>
-                <w:color w:val="334155"/>
-                <w:sz w:val="19"/>
-              </w:rPr>
-              <w:t>• Google Play Store: Trusted Web Activity via Bubblewrap generates production-signed app-release-bundle.aab.</w:t>
-              <w:br/>
-              <w:t>• Apple App Store: Capacitor 6.0 iOS wrapper packages Retina icons, touch gestures, and Xcode project for TestFlight.</w:t>
-              <w:br/>
-              <w:t>• Instant PWA WebAPK: Users can install directly from Google Chrome or Safari in 1-tap with zero app store delay.</w:t>
-            </w:r>
-          </w:p>
-        </w:tc>
-      </w:tr>
-    </w:tbl>
-    <w:p>
-      <w:pPr>
-        <w:spacing w:after="120"/>
-      </w:pPr>
     </w:p>
     <w:p>
       <w:pPr>
@@ -2432,7 +1303,7 @@
           <w:color w:val="0F172A"/>
           <w:sz w:val="32"/>
         </w:rPr>
-        <w:t>7. User Installation Steps &amp; Technology Stack</w:t>
+        <w:t>7. User Installation Walkthrough &amp; Technical Specifications</w:t>
       </w:r>
     </w:p>
     <w:tbl>
@@ -2453,10 +1324,10 @@
             <w:tcW w:type="dxa" w:w="3312"/>
             <w:shd w:fill="0F172A"/>
             <w:tcMar>
-              <w:top w:w="80" w:type="dxa"/>
-              <w:bottom w:w="80" w:type="dxa"/>
-              <w:left w:w="100" w:type="dxa"/>
-              <w:right w:w="100" w:type="dxa"/>
+              <w:top w:w="70" w:type="dxa"/>
+              <w:bottom w:w="70" w:type="dxa"/>
+              <w:left w:w="90" w:type="dxa"/>
+              <w:right w:w="90" w:type="dxa"/>
             </w:tcMar>
           </w:tcPr>
           <w:p>
@@ -2466,10 +1337,10 @@
             <w:r>
               <w:rPr>
                 <w:b/>
-                <w:color w:val="FFFFFF"/>
-                <w:sz w:val="17"/>
+                <w:color w:val="38BDF8"/>
+                <w:sz w:val="16"/>
               </w:rPr>
-              <w:t>CHANNEL</w:t>
+              <w:t>DEPLOYMENT CHANNEL</w:t>
             </w:r>
           </w:p>
         </w:tc>
@@ -2478,10 +1349,10 @@
             <w:tcW w:type="dxa" w:w="3312"/>
             <w:shd w:fill="0F172A"/>
             <w:tcMar>
-              <w:top w:w="80" w:type="dxa"/>
-              <w:bottom w:w="80" w:type="dxa"/>
-              <w:left w:w="100" w:type="dxa"/>
-              <w:right w:w="100" w:type="dxa"/>
+              <w:top w:w="70" w:type="dxa"/>
+              <w:bottom w:w="70" w:type="dxa"/>
+              <w:left w:w="90" w:type="dxa"/>
+              <w:right w:w="90" w:type="dxa"/>
             </w:tcMar>
           </w:tcPr>
           <w:p>
@@ -2491,10 +1362,10 @@
             <w:r>
               <w:rPr>
                 <w:b/>
-                <w:color w:val="FFFFFF"/>
-                <w:sz w:val="17"/>
+                <w:color w:val="38BDF8"/>
+                <w:sz w:val="16"/>
               </w:rPr>
-              <w:t>USER ACTIONS</w:t>
+              <w:t>USER INSTALLATION STEPS</w:t>
             </w:r>
           </w:p>
         </w:tc>
@@ -2503,10 +1374,10 @@
             <w:tcW w:type="dxa" w:w="3312"/>
             <w:shd w:fill="0F172A"/>
             <w:tcMar>
-              <w:top w:w="80" w:type="dxa"/>
-              <w:bottom w:w="80" w:type="dxa"/>
-              <w:left w:w="100" w:type="dxa"/>
-              <w:right w:w="100" w:type="dxa"/>
+              <w:top w:w="70" w:type="dxa"/>
+              <w:bottom w:w="70" w:type="dxa"/>
+              <w:left w:w="90" w:type="dxa"/>
+              <w:right w:w="90" w:type="dxa"/>
             </w:tcMar>
           </w:tcPr>
           <w:p>
@@ -2516,10 +1387,10 @@
             <w:r>
               <w:rPr>
                 <w:b/>
-                <w:color w:val="FFFFFF"/>
-                <w:sz w:val="17"/>
+                <w:color w:val="38BDF8"/>
+                <w:sz w:val="16"/>
               </w:rPr>
-              <w:t>EXPERIENCE &amp; BENEFITS</w:t>
+              <w:t>EXPERIENCE ATTRIBUTES</w:t>
             </w:r>
           </w:p>
         </w:tc>
@@ -2570,7 +1441,7 @@
                 <w:color w:val="0F172A"/>
                 <w:sz w:val="17"/>
               </w:rPr>
-              <w:t>Search 'Namma Travel App' → Tap 'Install'</w:t>
+              <w:t>Search 'Namma Travel' → Tap 'Install'</w:t>
             </w:r>
           </w:p>
         </w:tc>
@@ -2594,7 +1465,7 @@
                 <w:color w:val="0F172A"/>
                 <w:sz w:val="17"/>
               </w:rPr>
-              <w:t>Verified AAB package, auto background updates, Google Play Protect</w:t>
+              <w:t>Google Play Protect verified, automatic background updates, native home icon</w:t>
             </w:r>
           </w:p>
         </w:tc>
@@ -2621,7 +1492,7 @@
                 <w:color w:val="0F172A"/>
                 <w:sz w:val="17"/>
               </w:rPr>
-              <w:t>Android Direct Install (PWA WebAPK)</w:t>
+              <w:t>Android Direct Install (WebAPK)</w:t>
             </w:r>
           </w:p>
         </w:tc>
@@ -2669,7 +1540,7 @@
                 <w:color w:val="0F172A"/>
                 <w:sz w:val="17"/>
               </w:rPr>
-              <w:t>Instant install without 50MB download, home screen icon, offline mode</w:t>
+              <w:t>Zero storage friction, instant native APK compilation, offline cache ready</w:t>
             </w:r>
           </w:p>
         </w:tc>
@@ -2720,7 +1591,7 @@
                 <w:color w:val="0F172A"/>
                 <w:sz w:val="17"/>
               </w:rPr>
-              <w:t>Download via TestFlight or App Store link</w:t>
+              <w:t>Download via TestFlight or App Store Link</w:t>
             </w:r>
           </w:p>
         </w:tc>
@@ -2744,7 +1615,7 @@
                 <w:color w:val="0F172A"/>
                 <w:sz w:val="17"/>
               </w:rPr>
-              <w:t>Native iOS navigation, Dark Mode support, Apple Pay integration</w:t>
+              <w:t>Native iOS ergonomics, Dynamic Island / Notch safe-area, dark mode default</w:t>
             </w:r>
           </w:p>
         </w:tc>
@@ -2771,7 +1642,7 @@
                 <w:color w:val="0F172A"/>
                 <w:sz w:val="17"/>
               </w:rPr>
-              <w:t>iPhone Safari PWA</w:t>
+              <w:t>iPhone Safari Standalone</w:t>
             </w:r>
           </w:p>
         </w:tc>
@@ -2795,7 +1666,7 @@
                 <w:color w:val="0F172A"/>
                 <w:sz w:val="17"/>
               </w:rPr>
-              <w:t>Open URL in Safari → Share (⎙) → 'Add to Home Screen'</w:t>
+              <w:t>Open Safari → Share (⎙) → 'Add to Home Screen'</w:t>
             </w:r>
           </w:p>
         </w:tc>
@@ -2819,7 +1690,7 @@
                 <w:color w:val="0F172A"/>
                 <w:sz w:val="17"/>
               </w:rPr>
-              <w:t>Full-screen standalone mode, notch &amp; dynamic island safe area</w:t>
+              <w:t>Full-screen standalone mode without Safari address bars, Retina vector icon</w:t>
             </w:r>
           </w:p>
         </w:tc>
@@ -2847,7 +1718,7 @@
         <w:tc>
           <w:tcPr>
             <w:tcW w:type="dxa" w:w="2484"/>
-            <w:shd w:fill="1A73E8"/>
+            <w:shd w:fill="0F172A"/>
             <w:tcMar>
               <w:top w:w="60" w:type="dxa"/>
               <w:bottom w:w="60" w:type="dxa"/>
@@ -2862,17 +1733,17 @@
             <w:r>
               <w:rPr>
                 <w:b/>
-                <w:color w:val="FFFFFF"/>
-                <w:sz w:val="16"/>
+                <w:color w:val="38BDF8"/>
+                <w:sz w:val="15"/>
               </w:rPr>
-              <w:t>BACKEND API</w:t>
+              <w:t>GENAI CORE</w:t>
             </w:r>
           </w:p>
         </w:tc>
         <w:tc>
           <w:tcPr>
             <w:tcW w:type="dxa" w:w="2484"/>
-            <w:shd w:fill="1A73E8"/>
+            <w:shd w:fill="0F172A"/>
             <w:tcMar>
               <w:top w:w="60" w:type="dxa"/>
               <w:bottom w:w="60" w:type="dxa"/>
@@ -2887,17 +1758,17 @@
             <w:r>
               <w:rPr>
                 <w:b/>
-                <w:color w:val="FFFFFF"/>
-                <w:sz w:val="16"/>
+                <w:color w:val="38BDF8"/>
+                <w:sz w:val="15"/>
               </w:rPr>
-              <w:t>MAP ENGINE</w:t>
+              <w:t>REST / ASYNC API</w:t>
             </w:r>
           </w:p>
         </w:tc>
         <w:tc>
           <w:tcPr>
             <w:tcW w:type="dxa" w:w="2484"/>
-            <w:shd w:fill="1A73E8"/>
+            <w:shd w:fill="0F172A"/>
             <w:tcMar>
               <w:top w:w="60" w:type="dxa"/>
               <w:bottom w:w="60" w:type="dxa"/>
@@ -2912,8 +1783,8 @@
             <w:r>
               <w:rPr>
                 <w:b/>
-                <w:color w:val="FFFFFF"/>
-                <w:sz w:val="16"/>
+                <w:color w:val="38BDF8"/>
+                <w:sz w:val="15"/>
               </w:rPr>
               <w:t>CROSS-PLATFORM</w:t>
             </w:r>
@@ -2922,7 +1793,7 @@
         <w:tc>
           <w:tcPr>
             <w:tcW w:type="dxa" w:w="2484"/>
-            <w:shd w:fill="1A73E8"/>
+            <w:shd w:fill="0F172A"/>
             <w:tcMar>
               <w:top w:w="60" w:type="dxa"/>
               <w:bottom w:w="60" w:type="dxa"/>
@@ -2937,10 +1808,10 @@
             <w:r>
               <w:rPr>
                 <w:b/>
-                <w:color w:val="FFFFFF"/>
-                <w:sz w:val="16"/>
+                <w:color w:val="38BDF8"/>
+                <w:sz w:val="15"/>
               </w:rPr>
-              <w:t>TEST COVERAGE</w:t>
+              <w:t>TEST SUITE</w:t>
             </w:r>
           </w:p>
         </w:tc>
@@ -2949,7 +1820,7 @@
         <w:tc>
           <w:tcPr>
             <w:tcW w:type="dxa" w:w="2484"/>
-            <w:shd w:fill="F1F5F9"/>
+            <w:shd w:fill="1E293B"/>
             <w:tcMar>
               <w:top w:w="60" w:type="dxa"/>
               <w:bottom w:w="60" w:type="dxa"/>
@@ -2963,19 +1834,19 @@
             </w:pPr>
             <w:r>
               <w:rPr>
-                <w:color w:val="0F172A"/>
+                <w:color w:val="F1F5F9"/>
                 <w:sz w:val="16"/>
               </w:rPr>
-              <w:t>Python FastAPI</w:t>
+              <w:t>Google Gemini 2.5 Flash</w:t>
               <w:br/>
-              <w:t>Uvicorn Daemon</w:t>
+              <w:t>+ Local Heuristics</w:t>
             </w:r>
           </w:p>
         </w:tc>
         <w:tc>
           <w:tcPr>
             <w:tcW w:type="dxa" w:w="2484"/>
-            <w:shd w:fill="F1F5F9"/>
+            <w:shd w:fill="1E293B"/>
             <w:tcMar>
               <w:top w:w="60" w:type="dxa"/>
               <w:bottom w:w="60" w:type="dxa"/>
@@ -2989,19 +1860,19 @@
             </w:pPr>
             <w:r>
               <w:rPr>
-                <w:color w:val="0F172A"/>
+                <w:color w:val="F1F5F9"/>
                 <w:sz w:val="16"/>
               </w:rPr>
-              <w:t>Leaflet Maps</w:t>
+              <w:t>Python FastAPI</w:t>
               <w:br/>
-              <w:t>OpenStreetMap GPS</w:t>
+              <w:t>Uvicorn Daemon</w:t>
             </w:r>
           </w:p>
         </w:tc>
         <w:tc>
           <w:tcPr>
             <w:tcW w:type="dxa" w:w="2484"/>
-            <w:shd w:fill="F1F5F9"/>
+            <w:shd w:fill="1E293B"/>
             <w:tcMar>
               <w:top w:w="60" w:type="dxa"/>
               <w:bottom w:w="60" w:type="dxa"/>
@@ -3015,7 +1886,7 @@
             </w:pPr>
             <w:r>
               <w:rPr>
-                <w:color w:val="0F172A"/>
+                <w:color w:val="F1F5F9"/>
                 <w:sz w:val="16"/>
               </w:rPr>
               <w:t>Capacitor 6.0</w:t>
@@ -3027,7 +1898,7 @@
         <w:tc>
           <w:tcPr>
             <w:tcW w:type="dxa" w:w="2484"/>
-            <w:shd w:fill="F1F5F9"/>
+            <w:shd w:fill="1E293B"/>
             <w:tcMar>
               <w:top w:w="60" w:type="dxa"/>
               <w:bottom w:w="60" w:type="dxa"/>
@@ -3041,12 +1912,12 @@
             </w:pPr>
             <w:r>
               <w:rPr>
-                <w:color w:val="0F172A"/>
+                <w:color w:val="F1F5F9"/>
                 <w:sz w:val="16"/>
               </w:rPr>
-              <w:t>15/15 Pytest</w:t>
+              <w:t>15/15 Pytest Passing</w:t>
               <w:br/>
-              <w:t>Auth + Tools</w:t>
+              <w:t>Auth + Tools Suite</w:t>
             </w:r>
           </w:p>
         </w:tc>
@@ -3075,9 +1946,9 @@
       <w:rPr>
         <w:rFonts w:ascii="Calibri" w:hAnsi="Calibri"/>
         <w:color w:val="94A3B8"/>
-        <w:sz w:val="17"/>
-      </w:rPr>
-      <w:t>Confidential &amp; Proprietary • Android &amp; iOS Cross-Platform Architecture • 2026</w:t>
+        <w:sz w:val="16"/>
+      </w:rPr>
+      <w:t>CONFIDENTIAL • GDG CLOUD BENGALURU • FORK. BUILD. MERGE. • 2026</w:t>
     </w:r>
   </w:p>
 </w:ftr>
@@ -3094,9 +1965,9 @@
       <w:rPr>
         <w:rFonts w:ascii="Calibri" w:hAnsi="Calibri"/>
         <w:color w:val="94A3B8"/>
-        <w:sz w:val="17"/>
-      </w:rPr>
-      <w:t>Namma Travel — Mobile Executive Briefing</w:t>
+        <w:sz w:val="16"/>
+      </w:rPr>
+      <w:t>NAMMA TRAVEL // AUTONOMOUS AI AGENT &amp; MOBILE BRIEFING</w:t>
     </w:r>
   </w:p>
 </w:hdr>

</xml_diff>